<commit_message>
Update performance metrics in ESI classification report
</commit_message>
<xml_diff>
--- a/Sprawozdanie problem klasyfikacyjny ESI.docx
+++ b/Sprawozdanie problem klasyfikacyjny ESI.docx
@@ -188,10 +188,12 @@
     </w:p>
     <w:p>
       <w:pPr>
+        <w:pStyle w:val="ListParagraph"/>
         <w:numPr>
           <w:ilvl w:val="0"/>
-          <w:numId w:val="11"/>
+          <w:numId w:val="21"/>
         </w:numPr>
+        <w:spacing w:line="360" w:lineRule="auto"/>
       </w:pPr>
       <w:r>
         <w:t>8 neuronów: Test (Średnia/Max): 65.5% / 66.7% | Trening (Średnia/Max): 68.1% / 69.2%</w:t>
@@ -199,10 +201,12 @@
     </w:p>
     <w:p>
       <w:pPr>
+        <w:pStyle w:val="ListParagraph"/>
         <w:numPr>
           <w:ilvl w:val="0"/>
-          <w:numId w:val="11"/>
+          <w:numId w:val="21"/>
         </w:numPr>
+        <w:spacing w:line="360" w:lineRule="auto"/>
       </w:pPr>
       <w:r>
         <w:t>16 neuronów: Test (Średnia/Max): 71.5% / 73.7% | Trening (Średnia/Max): 72.9% / 76.7%</w:t>
@@ -210,10 +214,12 @@
     </w:p>
     <w:p>
       <w:pPr>
+        <w:pStyle w:val="ListParagraph"/>
         <w:numPr>
           <w:ilvl w:val="0"/>
-          <w:numId w:val="11"/>
+          <w:numId w:val="21"/>
         </w:numPr>
+        <w:spacing w:line="360" w:lineRule="auto"/>
       </w:pPr>
       <w:r>
         <w:t>32 neurony: Test (Średnia/Max): 80.9% / 83.6% | Trening (Średnia/Max): 77.8% / 78.6%</w:t>
@@ -221,10 +227,12 @@
     </w:p>
     <w:p>
       <w:pPr>
+        <w:pStyle w:val="ListParagraph"/>
         <w:numPr>
           <w:ilvl w:val="0"/>
-          <w:numId w:val="11"/>
+          <w:numId w:val="21"/>
         </w:numPr>
+        <w:spacing w:line="360" w:lineRule="auto"/>
       </w:pPr>
       <w:r>
         <w:t>64 neurony: Test (Średnia/Max): 75.2% / 76.0% | Trening (Średnia/Max): 80.7% / 82.1%</w:t>
@@ -261,46 +269,96 @@
     </w:p>
     <w:p>
       <w:pPr>
+        <w:pStyle w:val="ListParagraph"/>
         <w:numPr>
           <w:ilvl w:val="0"/>
-          <w:numId w:val="1"/>
+          <w:numId w:val="20"/>
         </w:numPr>
-      </w:pPr>
-      <w:r>
-        <w:t>0.01: Test: 36.6% | Trening: 33.7%</w:t>
-      </w:r>
-    </w:p>
-    <w:p>
-      <w:pPr>
+        <w:spacing w:line="360" w:lineRule="auto"/>
+      </w:pPr>
+      <w:r>
+        <w:t xml:space="preserve">0.01: Test: </w:t>
+      </w:r>
+      <w:r>
+        <w:t>(</w:t>
+      </w:r>
+      <w:r>
+        <w:t xml:space="preserve">Średnia/Max):  36.6% /  39.8% </w:t>
+      </w:r>
+      <w:r>
+        <w:t xml:space="preserve">| Trening: </w:t>
+      </w:r>
+      <w:r>
+        <w:t>(Średnia/Max):  33.7% /  33.8%</w:t>
+      </w:r>
+    </w:p>
+    <w:p>
+      <w:pPr>
+        <w:pStyle w:val="ListParagraph"/>
         <w:numPr>
           <w:ilvl w:val="0"/>
-          <w:numId w:val="1"/>
+          <w:numId w:val="20"/>
         </w:numPr>
-      </w:pPr>
-      <w:r>
-        <w:t>0.05: Test: 57.1% | Trening: 60.9%</w:t>
-      </w:r>
-    </w:p>
-    <w:p>
-      <w:pPr>
+        <w:spacing w:line="360" w:lineRule="auto"/>
+      </w:pPr>
+      <w:r>
+        <w:t xml:space="preserve">0.05: Test: </w:t>
+      </w:r>
+      <w:r>
+        <w:t xml:space="preserve">(Średnia/Max):  57.1% /  63.7% </w:t>
+      </w:r>
+      <w:r>
+        <w:t xml:space="preserve">| Trening: </w:t>
+      </w:r>
+      <w:r>
+        <w:t>(Średnia/Max):  60.9% /  62.7%</w:t>
+      </w:r>
+    </w:p>
+    <w:p>
+      <w:pPr>
+        <w:pStyle w:val="ListParagraph"/>
         <w:numPr>
           <w:ilvl w:val="0"/>
-          <w:numId w:val="1"/>
+          <w:numId w:val="20"/>
         </w:numPr>
-      </w:pPr>
-      <w:r>
-        <w:t>0.1: Test: 76.0% | Trening: 73.4%</w:t>
-      </w:r>
-    </w:p>
-    <w:p>
-      <w:pPr>
+        <w:spacing w:line="360" w:lineRule="auto"/>
+      </w:pPr>
+      <w:r>
+        <w:t xml:space="preserve">0.1: Test: </w:t>
+      </w:r>
+      <w:r>
+        <w:t xml:space="preserve">(Średnia/Max):  76.0% /  80.7% </w:t>
+      </w:r>
+      <w:r>
+        <w:t xml:space="preserve">| Trening: </w:t>
+      </w:r>
+      <w:r>
+        <w:t>(Średnia/Max):  73.4% /  75.5</w:t>
+      </w:r>
+      <w:r>
+        <w:t>%</w:t>
+      </w:r>
+    </w:p>
+    <w:p>
+      <w:pPr>
+        <w:pStyle w:val="ListParagraph"/>
         <w:numPr>
           <w:ilvl w:val="0"/>
-          <w:numId w:val="1"/>
+          <w:numId w:val="20"/>
         </w:numPr>
-      </w:pPr>
-      <w:r>
-        <w:t>0.5: Test: 85.0% | Trening: 86.2%</w:t>
+        <w:spacing w:line="360" w:lineRule="auto"/>
+      </w:pPr>
+      <w:r>
+        <w:t xml:space="preserve">0.5: Test: </w:t>
+      </w:r>
+      <w:r>
+        <w:t xml:space="preserve">(Średnia/Max):  85.0% /  87.7% </w:t>
+      </w:r>
+      <w:r>
+        <w:t xml:space="preserve"> | Trening: </w:t>
+      </w:r>
+      <w:r>
+        <w:t>(Średnia/Max):  86.2% /  87.1%</w:t>
       </w:r>
     </w:p>
     <w:p>
@@ -334,7 +392,16 @@
         </w:numPr>
       </w:pPr>
       <w:r>
-        <w:t>100 epok: Test: 48.5% | Trening: 42.8%</w:t>
+        <w:t xml:space="preserve">100 epok: Test: </w:t>
+      </w:r>
+      <w:r>
+        <w:t>(Średnia/Max):  48.5% /  52.6%</w:t>
+      </w:r>
+      <w:r>
+        <w:t xml:space="preserve"> | Trening: </w:t>
+      </w:r>
+      <w:r>
+        <w:t>(Średnia/Max):  42.8% /  44.8%</w:t>
       </w:r>
     </w:p>
     <w:p>
@@ -345,7 +412,17 @@
         </w:numPr>
       </w:pPr>
       <w:r>
-        <w:t>300 epok: Test: 62.2% | Trening: 62.7%</w:t>
+        <w:lastRenderedPageBreak/>
+        <w:t xml:space="preserve">300 epok: Test: </w:t>
+      </w:r>
+      <w:r>
+        <w:t xml:space="preserve">(Średnia/Max):  62.2% /  65.5% </w:t>
+      </w:r>
+      <w:r>
+        <w:t xml:space="preserve">| Trening: </w:t>
+      </w:r>
+      <w:r>
+        <w:t>(Średnia/Max):  62.7% /  64.6%</w:t>
       </w:r>
     </w:p>
     <w:p>
@@ -356,7 +433,16 @@
         </w:numPr>
       </w:pPr>
       <w:r>
-        <w:t>600 epok: Test: 74.5% | Trening: 76.9%</w:t>
+        <w:t xml:space="preserve">600 epok: Test: </w:t>
+      </w:r>
+      <w:r>
+        <w:t xml:space="preserve">(Średnia/Max):  74.5% /  78.9% </w:t>
+      </w:r>
+      <w:r>
+        <w:t xml:space="preserve">| Trening: </w:t>
+      </w:r>
+      <w:r>
+        <w:t>(Średnia/Max):  76.9% /  78.1%</w:t>
       </w:r>
     </w:p>
     <w:p>
@@ -367,7 +453,13 @@
         </w:numPr>
       </w:pPr>
       <w:r>
-        <w:t>1000 epok: Test: 78.2% | Trening: 81.6%</w:t>
+        <w:t xml:space="preserve">1000 epok: Test: </w:t>
+      </w:r>
+      <w:r>
+        <w:t xml:space="preserve">(Średnia/Max):  78.2% /  81.3% </w:t>
+      </w:r>
+      <w:r>
+        <w:t>| Trening: 81.6%</w:t>
       </w:r>
     </w:p>
     <w:p>
@@ -379,7 +471,6 @@
           <w:i/>
           <w:iCs/>
         </w:rPr>
-        <w:lastRenderedPageBreak/>
         <w:t>Wniosek:</w:t>
       </w:r>
       <w:r>
@@ -402,46 +493,54 @@
     </w:p>
     <w:p>
       <w:pPr>
+        <w:pStyle w:val="ListParagraph"/>
         <w:numPr>
           <w:ilvl w:val="0"/>
-          <w:numId w:val="7"/>
+          <w:numId w:val="17"/>
         </w:numPr>
-      </w:pPr>
-      <w:r>
-        <w:t>0.1 (10%): Test: 73.6% | Trening: 73.5%</w:t>
-      </w:r>
-    </w:p>
-    <w:p>
-      <w:pPr>
+        <w:spacing w:line="360" w:lineRule="auto"/>
+      </w:pPr>
+      <w:r>
+        <w:t>(10%): Test (Średnia/Max): 73.6% / 77.9% | Trening (Średnia/Max): 73.5% / 74.0%</w:t>
+      </w:r>
+    </w:p>
+    <w:p>
+      <w:pPr>
+        <w:pStyle w:val="ListParagraph"/>
         <w:numPr>
           <w:ilvl w:val="0"/>
-          <w:numId w:val="7"/>
+          <w:numId w:val="17"/>
         </w:numPr>
-      </w:pPr>
-      <w:r>
-        <w:t>0.2 (20%): Test: 73.1% | Trening: 73.5%</w:t>
-      </w:r>
-    </w:p>
-    <w:p>
-      <w:pPr>
+        <w:spacing w:line="360" w:lineRule="auto"/>
+      </w:pPr>
+      <w:r>
+        <w:t>(20%): Test (Średnia/Max): 73.1% / 78.4% | Trening (Średnia/Max): 73.5% / 75.5%</w:t>
+      </w:r>
+    </w:p>
+    <w:p>
+      <w:pPr>
+        <w:pStyle w:val="ListParagraph"/>
         <w:numPr>
           <w:ilvl w:val="0"/>
-          <w:numId w:val="7"/>
+          <w:numId w:val="17"/>
         </w:numPr>
-      </w:pPr>
-      <w:r>
-        <w:t>0.3 (30%): Test: 74.1% | Trening: 73.4%</w:t>
-      </w:r>
-    </w:p>
-    <w:p>
-      <w:pPr>
+        <w:spacing w:line="360" w:lineRule="auto"/>
+      </w:pPr>
+      <w:r>
+        <w:t>(30%): Test (Średnia/Max): 74.1% / 78.1% | Trening (Średnia/Max): 73.4% / 75.2%</w:t>
+      </w:r>
+    </w:p>
+    <w:p>
+      <w:pPr>
+        <w:pStyle w:val="ListParagraph"/>
         <w:numPr>
           <w:ilvl w:val="0"/>
-          <w:numId w:val="7"/>
+          <w:numId w:val="17"/>
         </w:numPr>
-      </w:pPr>
-      <w:r>
-        <w:t>0.4 (40%): Test: 71.4% | Trening: 73.3%</w:t>
+        <w:spacing w:line="360" w:lineRule="auto"/>
+      </w:pPr>
+      <w:r>
+        <w:t>(40%): Test (Średnia/Max): 71.4% / 73.9% | Trening (Średnia/Max): 73.3% / 76.1%</w:t>
       </w:r>
     </w:p>
     <w:p>
@@ -475,35 +574,41 @@
     </w:p>
     <w:p>
       <w:pPr>
+        <w:pStyle w:val="ListParagraph"/>
         <w:numPr>
           <w:ilvl w:val="0"/>
-          <w:numId w:val="12"/>
+          <w:numId w:val="17"/>
         </w:numPr>
-      </w:pPr>
-      <w:r>
-        <w:t>sigmoid: Test: 73.3% | Trening: 73.1%</w:t>
-      </w:r>
-    </w:p>
-    <w:p>
-      <w:pPr>
+        <w:spacing w:line="360" w:lineRule="auto"/>
+      </w:pPr>
+      <w:r>
+        <w:t>sigmoid: Test (Średnia/Max): 73.3% / 77.2% | Trening (Średnia/Max): 73.1% / 74.9%</w:t>
+      </w:r>
+    </w:p>
+    <w:p>
+      <w:pPr>
+        <w:pStyle w:val="ListParagraph"/>
         <w:numPr>
           <w:ilvl w:val="0"/>
-          <w:numId w:val="12"/>
+          <w:numId w:val="17"/>
         </w:numPr>
-      </w:pPr>
-      <w:r>
-        <w:t>tanh: Test: 84.2% | Trening: 85.7%</w:t>
-      </w:r>
-    </w:p>
-    <w:p>
-      <w:pPr>
+        <w:spacing w:line="360" w:lineRule="auto"/>
+      </w:pPr>
+      <w:r>
+        <w:t>tanh: Test (Średnia/Max): 84.2% / 88.9% | Trening (Średnia/Max): 85.7% / 86.9%</w:t>
+      </w:r>
+    </w:p>
+    <w:p>
+      <w:pPr>
+        <w:pStyle w:val="ListParagraph"/>
         <w:numPr>
           <w:ilvl w:val="0"/>
-          <w:numId w:val="12"/>
+          <w:numId w:val="17"/>
         </w:numPr>
-      </w:pPr>
-      <w:r>
-        <w:t>relu: Test: 84.6% | Trening: 86.2%</w:t>
+        <w:spacing w:line="360" w:lineRule="auto"/>
+      </w:pPr>
+      <w:r>
+        <w:t>relu: Test (Średnia/Max): 84.6% / 86.0% | Trening (Średnia/Max): 86.2% / 86.6%</w:t>
       </w:r>
     </w:p>
     <w:p>
@@ -518,7 +623,11 @@
         <w:t>Wniosek:</w:t>
       </w:r>
       <w:r>
-        <w:t xml:space="preserve"> Funkcja ReLU znacząco wyprzedziła klasyczną Sigmoidę (różnica ok. 11 punktów procentowych na zbiorze testowym) i dała nieznacznie lepsze wyniki od Tanh. </w:t>
+        <w:t xml:space="preserve"> Funkcja ReLU znacząco wyprzedziła klasyczną Sigmoidę (różnica ok. 11 punktów procentowych na zbiorze testowym) i dała nieznacznie lepsze wyniki od </w:t>
+      </w:r>
+      <w:r>
+        <w:lastRenderedPageBreak/>
+        <w:t xml:space="preserve">Tanh. </w:t>
       </w:r>
       <w:r>
         <w:t>Pozwoliło to na uniknięcie problemu gasnącego gradientu</w:t>
@@ -549,35 +658,41 @@
     </w:p>
     <w:p>
       <w:pPr>
+        <w:pStyle w:val="ListParagraph"/>
         <w:numPr>
           <w:ilvl w:val="0"/>
-          <w:numId w:val="13"/>
+          <w:numId w:val="17"/>
         </w:numPr>
-      </w:pPr>
-      <w:r>
-        <w:t>normal: Test: 71.2% | Trening: 74.5%</w:t>
-      </w:r>
-    </w:p>
-    <w:p>
-      <w:pPr>
+        <w:spacing w:line="360" w:lineRule="auto"/>
+      </w:pPr>
+      <w:r>
+        <w:t>normal: Test (Średnia/Max): 71.2% / 77.2% | Trening (Średnia/Max): 74.5% / 77.8%</w:t>
+      </w:r>
+    </w:p>
+    <w:p>
+      <w:pPr>
+        <w:pStyle w:val="ListParagraph"/>
         <w:numPr>
           <w:ilvl w:val="0"/>
-          <w:numId w:val="13"/>
+          <w:numId w:val="17"/>
         </w:numPr>
-      </w:pPr>
-      <w:r>
-        <w:t>xavier: Test: 75.0% | Trening: 78.8%</w:t>
-      </w:r>
-    </w:p>
-    <w:p>
-      <w:pPr>
+        <w:spacing w:line="360" w:lineRule="auto"/>
+      </w:pPr>
+      <w:r>
+        <w:t>xavier: Test (Średnia/Max): 75.0% / 78.4% | Trening (Średnia/Max): 78.8% / 79.1%</w:t>
+      </w:r>
+    </w:p>
+    <w:p>
+      <w:pPr>
+        <w:pStyle w:val="ListParagraph"/>
         <w:numPr>
           <w:ilvl w:val="0"/>
-          <w:numId w:val="13"/>
+          <w:numId w:val="17"/>
         </w:numPr>
-      </w:pPr>
-      <w:r>
-        <w:t>he: Test: 78.8% | Trening: 79.8%</w:t>
+        <w:spacing w:line="360" w:lineRule="auto"/>
+      </w:pPr>
+      <w:r>
+        <w:t>he: Test (Średnia/Max): 78.8% / 80.1% | Trening (Średnia/Max): 79.8% / 80.0%</w:t>
       </w:r>
     </w:p>
     <w:p>
@@ -611,47 +726,54 @@
     </w:p>
     <w:p>
       <w:pPr>
+        <w:pStyle w:val="ListParagraph"/>
         <w:numPr>
           <w:ilvl w:val="0"/>
-          <w:numId w:val="4"/>
+          <w:numId w:val="17"/>
         </w:numPr>
-      </w:pPr>
-      <w:r>
-        <w:t>None (Full Batch): Test: 76.2% | Trening: 75.8%</w:t>
-      </w:r>
-    </w:p>
-    <w:p>
-      <w:pPr>
+        <w:spacing w:line="360" w:lineRule="auto"/>
+      </w:pPr>
+      <w:r>
+        <w:t>None (Full Batch): Test (Średnia/Max): 76.2% / 78.9% | Trening (Średnia/Max): 75.8% / 77.4%</w:t>
+      </w:r>
+    </w:p>
+    <w:p>
+      <w:pPr>
+        <w:pStyle w:val="ListParagraph"/>
         <w:numPr>
           <w:ilvl w:val="0"/>
-          <w:numId w:val="4"/>
+          <w:numId w:val="17"/>
         </w:numPr>
-      </w:pPr>
-      <w:r>
-        <w:t>32: Test: 89.7% | Trening: 91.2%</w:t>
-      </w:r>
-    </w:p>
-    <w:p>
-      <w:pPr>
+        <w:spacing w:line="360" w:lineRule="auto"/>
+      </w:pPr>
+      <w:r>
+        <w:t>32: Test (Średnia/Max): 89.7% / 90.1% | Trening (Średnia/Max): 91.2% / 91.8%</w:t>
+      </w:r>
+    </w:p>
+    <w:p>
+      <w:pPr>
+        <w:pStyle w:val="ListParagraph"/>
         <w:numPr>
           <w:ilvl w:val="0"/>
-          <w:numId w:val="4"/>
+          <w:numId w:val="17"/>
         </w:numPr>
-      </w:pPr>
-      <w:r>
-        <w:lastRenderedPageBreak/>
-        <w:t>64: Test: 88.3% | Trening: 89.0%</w:t>
-      </w:r>
-    </w:p>
-    <w:p>
-      <w:pPr>
+        <w:spacing w:line="360" w:lineRule="auto"/>
+      </w:pPr>
+      <w:r>
+        <w:t>64: Test (Średnia/Max): 88.3% / 88.9% | Trening (Średnia/Max): 89.0% / 89.1%</w:t>
+      </w:r>
+    </w:p>
+    <w:p>
+      <w:pPr>
+        <w:pStyle w:val="ListParagraph"/>
         <w:numPr>
           <w:ilvl w:val="0"/>
-          <w:numId w:val="4"/>
+          <w:numId w:val="17"/>
         </w:numPr>
-      </w:pPr>
-      <w:r>
-        <w:t>128: Test: 84.4% | Trening: 87.6%</w:t>
+        <w:spacing w:line="360" w:lineRule="auto"/>
+      </w:pPr>
+      <w:r>
+        <w:t>128: Test (Średnia/Max): 84.4% / 85.4% | Trening (Średnia/Max): 87.6% / 88.0%</w:t>
       </w:r>
     </w:p>
     <w:p>
@@ -685,46 +807,54 @@
     </w:p>
     <w:p>
       <w:pPr>
+        <w:pStyle w:val="ListParagraph"/>
         <w:numPr>
           <w:ilvl w:val="0"/>
-          <w:numId w:val="3"/>
+          <w:numId w:val="17"/>
         </w:numPr>
-      </w:pPr>
-      <w:r>
-        <w:t>0.0: Test: 74.1% | Trening: 74.2%</w:t>
-      </w:r>
-    </w:p>
-    <w:p>
-      <w:pPr>
+        <w:spacing w:line="360" w:lineRule="auto"/>
+      </w:pPr>
+      <w:r>
+        <w:t>0.0: Test (Średnia/Max): 74.1% / 75.4% | Trening (Średnia/Max): 74.2% / 75.6%</w:t>
+      </w:r>
+    </w:p>
+    <w:p>
+      <w:pPr>
+        <w:pStyle w:val="ListParagraph"/>
         <w:numPr>
           <w:ilvl w:val="0"/>
-          <w:numId w:val="3"/>
+          <w:numId w:val="17"/>
         </w:numPr>
-      </w:pPr>
-      <w:r>
-        <w:t>0.5: Test: 78.0% | Trening: 81.7%</w:t>
-      </w:r>
-    </w:p>
-    <w:p>
-      <w:pPr>
+        <w:spacing w:line="360" w:lineRule="auto"/>
+      </w:pPr>
+      <w:r>
+        <w:t>0.5: Test (Średnia/Max): 78.0% / 78.4% | Trening (Średnia/Max): 81.7% / 82.2%</w:t>
+      </w:r>
+    </w:p>
+    <w:p>
+      <w:pPr>
+        <w:pStyle w:val="ListParagraph"/>
         <w:numPr>
           <w:ilvl w:val="0"/>
-          <w:numId w:val="3"/>
+          <w:numId w:val="17"/>
         </w:numPr>
-      </w:pPr>
-      <w:r>
-        <w:t>0.9: Test: 85.8% | Trening: 89.2%</w:t>
-      </w:r>
-    </w:p>
-    <w:p>
-      <w:pPr>
+        <w:spacing w:line="360" w:lineRule="auto"/>
+      </w:pPr>
+      <w:r>
+        <w:t>0.9: Test (Średnia/Max): 85.8% / 87.7% | Trening (Średnia/Max): 89.2% / 90.2%</w:t>
+      </w:r>
+    </w:p>
+    <w:p>
+      <w:pPr>
+        <w:pStyle w:val="ListParagraph"/>
         <w:numPr>
           <w:ilvl w:val="0"/>
-          <w:numId w:val="3"/>
+          <w:numId w:val="17"/>
         </w:numPr>
-      </w:pPr>
-      <w:r>
-        <w:t>0.99: Test: 89.1% | Trening: 95.1%</w:t>
+        <w:spacing w:line="360" w:lineRule="auto"/>
+      </w:pPr>
+      <w:r>
+        <w:t>0.99: Test (Średnia/Max): 89.1% / 90.6% | Trening (Średnia/Max): 95.1% / 96.0%</w:t>
       </w:r>
     </w:p>
     <w:p>
@@ -760,6 +890,7 @@
           <w:b/>
           <w:bCs/>
         </w:rPr>
+        <w:lastRenderedPageBreak/>
         <w:t>4. Badanie parametrów - Metody Uczenia Maszynowego (UM)</w:t>
       </w:r>
     </w:p>
@@ -876,7 +1007,6 @@
         </w:numPr>
       </w:pPr>
       <w:r>
-        <w:lastRenderedPageBreak/>
         <w:t>K = 5: Uczący: 91.78% | Testowy: 87.72%</w:t>
       </w:r>
     </w:p>
@@ -995,6 +1125,7 @@
         </w:numPr>
       </w:pPr>
       <w:r>
+        <w:lastRenderedPageBreak/>
         <w:t>10 drzew: Uczący: 99.71% | Testowy: 84.80%</w:t>
       </w:r>
     </w:p>
@@ -1109,7 +1240,6 @@
         </w:numPr>
       </w:pPr>
       <w:r>
-        <w:lastRenderedPageBreak/>
         <w:t>Wśród gotowych modeli z biblioteki SciKit-Learn najlepiej z problemem poradził sobie Las Losowy oraz SVM (jądro RBF) - oba uzyskując skuteczność rzędu 88.8% - 89.4%. Drzewo decyzyjne wypadło najgorzej pod kątem generalizacji wiedzy z racji tendencji do błyskawicznego przeuczania się na węzłach liści.</w:t>
       </w:r>
     </w:p>
@@ -1147,6 +1277,7 @@
     </w:p>
     <w:p>
       <w:r>
+        <w:lastRenderedPageBreak/>
         <w:t xml:space="preserve"> Wartość: 32       | TEST (Średnia/Max):  80.9% /  83.6% | TRENING (Średnia/Max):  77.8% /  78.6%</w:t>
       </w:r>
     </w:p>
@@ -1194,253 +1325,686 @@
     </w:p>
     <w:p>
       <w:r>
+        <w:t xml:space="preserve"> Wartość: 300      | TEST (Średnia/Max):  62.2% /  65.5% | TRENING (Średnia/Max):  62.7% /  64.6%</w:t>
+      </w:r>
+    </w:p>
+    <w:p>
+      <w:r>
+        <w:t xml:space="preserve"> Wartość: 600      | TEST (Średnia/Max):  74.5% /  78.9% | TRENING (Średnia/Max):  76.9% /  78.1%</w:t>
+      </w:r>
+    </w:p>
+    <w:p>
+      <w:r>
+        <w:t xml:space="preserve"> Wartość: 1000     | TEST (Średnia/Max):  78.2% /  81.3% | TRENING (Średnia/Max):  81.6% /  82.1%</w:t>
+      </w:r>
+    </w:p>
+    <w:p/>
+    <w:p>
+      <w:r>
+        <w:t>[TEST_SIZE] Badanie wpływu parametru...</w:t>
+      </w:r>
+    </w:p>
+    <w:p>
+      <w:r>
+        <w:t xml:space="preserve"> Wartość: 0.1      | TEST (Średnia/Max):  73.6% /  77.9% | TRENING (Średnia/Max):  73.5% /  74.0%</w:t>
+      </w:r>
+    </w:p>
+    <w:p>
+      <w:r>
+        <w:t xml:space="preserve"> Wartość: 0.2      | TEST (Średnia/Max):  73.1% /  78.4% | TRENING (Średnia/Max):  73.5% /  75.5%</w:t>
+      </w:r>
+    </w:p>
+    <w:p>
+      <w:r>
+        <w:t xml:space="preserve"> Wartość: 0.3      | TEST (Średnia/Max):  74.1% /  78.1% | TRENING (Średnia/Max):  73.4% /  75.2%</w:t>
+      </w:r>
+    </w:p>
+    <w:p>
+      <w:r>
         <w:lastRenderedPageBreak/>
-        <w:t xml:space="preserve"> Wartość: 300      | TEST (Średnia/Max):  62.2% /  65.5% | TRENING (Średnia/Max):  62.7% /  64.6%</w:t>
-      </w:r>
-    </w:p>
-    <w:p>
-      <w:r>
-        <w:t xml:space="preserve"> Wartość: 600      | TEST (Średnia/Max):  74.5% /  78.9% | TRENING (Średnia/Max):  76.9% /  78.1%</w:t>
-      </w:r>
-    </w:p>
-    <w:p>
-      <w:r>
-        <w:t xml:space="preserve"> Wartość: 1000     | TEST (Średnia/Max):  78.2% /  81.3% | TRENING (Średnia/Max):  81.6% /  82.1%</w:t>
+        <w:t xml:space="preserve"> Wartość: 0.4      | TEST (Średnia/Max):  71.4% /  73.9% | TRENING (Średnia/Max):  73.3% /  76.1%</w:t>
       </w:r>
     </w:p>
     <w:p/>
     <w:p>
       <w:r>
-        <w:t>[TEST_SIZE] Badanie wpływu parametru...</w:t>
-      </w:r>
-    </w:p>
-    <w:p>
-      <w:r>
-        <w:t xml:space="preserve"> Wartość: 0.1      | TEST (Średnia/Max):  73.6% /  77.9% | TRENING (Średnia/Max):  73.5% /  74.0%</w:t>
-      </w:r>
-    </w:p>
-    <w:p>
-      <w:r>
-        <w:t xml:space="preserve"> Wartość: 0.2      | TEST (Średnia/Max):  73.1% /  78.4% | TRENING (Średnia/Max):  73.5% /  75.5%</w:t>
-      </w:r>
-    </w:p>
-    <w:p>
-      <w:r>
-        <w:t xml:space="preserve"> Wartość: 0.3      | TEST (Średnia/Max):  74.1% /  78.1% | TRENING (Średnia/Max):  73.4% /  75.2%</w:t>
-      </w:r>
-    </w:p>
-    <w:p>
-      <w:r>
-        <w:t xml:space="preserve"> Wartość: 0.4      | TEST (Średnia/Max):  71.4% /  73.9% | TRENING (Średnia/Max):  73.3% /  76.1%</w:t>
+        <w:t>[ACTIVATION] Badanie wpływu parametru...</w:t>
+      </w:r>
+    </w:p>
+    <w:p>
+      <w:r>
+        <w:t xml:space="preserve"> Wartość: sigmoid  | TEST (Średnia/Max):  73.3% /  77.2% | TRENING (Średnia/Max):  73.1% /  74.9%</w:t>
+      </w:r>
+    </w:p>
+    <w:p>
+      <w:r>
+        <w:t xml:space="preserve"> Wartość: tanh     | TEST (Średnia/Max):  84.2% /  88.9% | TRENING (Średnia/Max):  85.7% /  86.9%</w:t>
+      </w:r>
+    </w:p>
+    <w:p>
+      <w:r>
+        <w:t xml:space="preserve"> Wartość: relu     | TEST (Średnia/Max):  84.6% /  86.0% | TRENING (Średnia/Max):  86.2% /  86.6%</w:t>
+      </w:r>
+    </w:p>
+    <w:p>
+      <w:r>
+        <w:t xml:space="preserve"> Wartość: sigmoid  | TEST (Średnia/Max):  72.3% /  73.7% | TRENING (Średnia/Max):  73.4% /  74.3%</w:t>
       </w:r>
     </w:p>
     <w:p/>
     <w:p>
       <w:r>
-        <w:t>[ACTIVATION] Badanie wpływu parametru...</w:t>
-      </w:r>
-    </w:p>
-    <w:p>
-      <w:r>
-        <w:t xml:space="preserve"> Wartość: sigmoid  | TEST (Średnia/Max):  73.3% /  77.2% | TRENING (Średnia/Max):  73.1% /  74.9%</w:t>
-      </w:r>
-    </w:p>
-    <w:p>
-      <w:r>
-        <w:t xml:space="preserve"> Wartość: tanh     | TEST (Średnia/Max):  84.2% /  88.9% | TRENING (Średnia/Max):  85.7% /  86.9%</w:t>
-      </w:r>
-    </w:p>
-    <w:p>
-      <w:r>
-        <w:t xml:space="preserve"> Wartość: relu     | TEST (Średnia/Max):  84.6% /  86.0% | TRENING (Średnia/Max):  86.2% /  86.6%</w:t>
-      </w:r>
-    </w:p>
-    <w:p>
-      <w:r>
-        <w:t xml:space="preserve"> Wartość: sigmoid  | TEST (Średnia/Max):  72.3% /  73.7% | TRENING (Średnia/Max):  73.4% /  74.3%</w:t>
+        <w:t>[WEIGHT_INIT] Badanie wpływu parametru...</w:t>
+      </w:r>
+    </w:p>
+    <w:p>
+      <w:r>
+        <w:t xml:space="preserve"> Wartość: normal   | TEST (Średnia/Max):  71.2% /  77.2% | TRENING (Średnia/Max):  74.5% /  77.8%</w:t>
+      </w:r>
+    </w:p>
+    <w:p>
+      <w:r>
+        <w:t xml:space="preserve"> Wartość: xavier   | TEST (Średnia/Max):  75.0% /  78.4% | TRENING (Średnia/Max):  78.8% /  79.1%</w:t>
+      </w:r>
+    </w:p>
+    <w:p>
+      <w:r>
+        <w:t xml:space="preserve"> Wartość: he       | TEST (Średnia/Max):  78.8% /  80.1% | TRENING (Średnia/Max):  79.8% /  80.0%</w:t>
+      </w:r>
+    </w:p>
+    <w:p>
+      <w:r>
+        <w:t xml:space="preserve"> Wartość: normal   | TEST (Średnia/Max):  73.9% /  77.8% | TRENING (Średnia/Max):  73.3% /  73.6%</w:t>
       </w:r>
     </w:p>
     <w:p/>
     <w:p>
       <w:r>
-        <w:t>[WEIGHT_INIT] Badanie wpływu parametru...</w:t>
-      </w:r>
-    </w:p>
-    <w:p>
-      <w:r>
-        <w:t xml:space="preserve"> Wartość: normal   | TEST (Średnia/Max):  71.2% /  77.2% | TRENING (Średnia/Max):  74.5% /  77.8%</w:t>
-      </w:r>
-    </w:p>
-    <w:p>
-      <w:r>
-        <w:t xml:space="preserve"> Wartość: xavier   | TEST (Średnia/Max):  75.0% /  78.4% | TRENING (Średnia/Max):  78.8% /  79.1%</w:t>
-      </w:r>
-    </w:p>
-    <w:p>
-      <w:r>
-        <w:lastRenderedPageBreak/>
-        <w:t xml:space="preserve"> Wartość: he       | TEST (Średnia/Max):  78.8% /  80.1% | TRENING (Średnia/Max):  79.8% /  80.0%</w:t>
-      </w:r>
-    </w:p>
-    <w:p>
-      <w:r>
-        <w:t xml:space="preserve"> Wartość: normal   | TEST (Średnia/Max):  73.9% /  77.8% | TRENING (Średnia/Max):  73.3% /  73.6%</w:t>
+        <w:t>[BATCH_SIZE] Badanie wpływu parametru...</w:t>
+      </w:r>
+    </w:p>
+    <w:p>
+      <w:r>
+        <w:t xml:space="preserve"> Wartość: None     | TEST (Średnia/Max):  76.2% /  78.9% | TRENING (Średnia/Max):  75.8% /  77.4%</w:t>
+      </w:r>
+    </w:p>
+    <w:p>
+      <w:r>
+        <w:t xml:space="preserve"> Wartość: 32       | TEST (Średnia/Max):  89.7% /  90.1% | TRENING (Średnia/Max):  91.2% /  91.8%</w:t>
+      </w:r>
+    </w:p>
+    <w:p>
+      <w:r>
+        <w:t xml:space="preserve"> Wartość: 64       | TEST (Średnia/Max):  88.3% /  88.9% | TRENING (Średnia/Max):  89.0% /  89.1%</w:t>
+      </w:r>
+    </w:p>
+    <w:p>
+      <w:r>
+        <w:t xml:space="preserve"> Wartość: 128      | TEST (Średnia/Max):  84.4% /  85.4% | TRENING (Średnia/Max):  87.6% /  88.0%</w:t>
       </w:r>
     </w:p>
     <w:p/>
     <w:p>
       <w:r>
-        <w:t>[BATCH_SIZE] Badanie wpływu parametru...</w:t>
-      </w:r>
-    </w:p>
-    <w:p>
-      <w:r>
-        <w:t xml:space="preserve"> Wartość: None     | TEST (Średnia/Max):  76.2% /  78.9% | TRENING (Średnia/Max):  75.8% /  77.4%</w:t>
-      </w:r>
-    </w:p>
-    <w:p>
-      <w:r>
-        <w:t xml:space="preserve"> Wartość: 32       | TEST (Średnia/Max):  89.7% /  90.1% | TRENING (Średnia/Max):  91.2% /  91.8%</w:t>
-      </w:r>
-    </w:p>
-    <w:p>
-      <w:r>
-        <w:t xml:space="preserve"> Wartość: 64       | TEST (Średnia/Max):  88.3% /  88.9% | TRENING (Średnia/Max):  89.0% /  89.1%</w:t>
-      </w:r>
-    </w:p>
-    <w:p>
-      <w:r>
-        <w:t xml:space="preserve"> Wartość: 128      | TEST (Średnia/Max):  84.4% /  85.4% | TRENING (Średnia/Max):  87.6% /  88.0%</w:t>
+        <w:t>[MOMENTUM] Badanie wpływu parametru...</w:t>
+      </w:r>
+    </w:p>
+    <w:p>
+      <w:r>
+        <w:t xml:space="preserve"> Wartość: 0.0      | TEST (Średnia/Max):  74.1% /  75.4% | TRENING (Średnia/Max):  74.2% /  75.6%</w:t>
+      </w:r>
+    </w:p>
+    <w:p>
+      <w:r>
+        <w:t xml:space="preserve"> Wartość: 0.5      | TEST (Średnia/Max):  78.0% /  78.4% | TRENING (Średnia/Max):  81.7% /  82.2%</w:t>
+      </w:r>
+    </w:p>
+    <w:p>
+      <w:r>
+        <w:t xml:space="preserve"> Wartość: 0.9      | TEST (Średnia/Max):  85.8% /  87.7% | TRENING (Średnia/Max):  89.2% /  90.2%</w:t>
+      </w:r>
+    </w:p>
+    <w:p>
+      <w:r>
+        <w:t xml:space="preserve"> Wartość: 0.99     | TEST (Średnia/Max):  89.1% /  90.6% | TRENING (Średnia/Max):  95.1% /  96.0%</w:t>
+      </w:r>
+    </w:p>
+    <w:p>
+      <w:r>
+        <w:t>--- WYNIKI EKSPERYMENTÓW NA DANYCH (Liczba aut: 852) ---</w:t>
       </w:r>
     </w:p>
     <w:p/>
     <w:p>
       <w:r>
-        <w:t>[MOMENTUM] Badanie wpływu parametru...</w:t>
-      </w:r>
-    </w:p>
-    <w:p>
-      <w:r>
-        <w:t xml:space="preserve"> Wartość: 0.0      | TEST (Średnia/Max):  74.1% /  75.4% | TRENING (Średnia/Max):  74.2% /  75.6%</w:t>
-      </w:r>
-    </w:p>
-    <w:p>
-      <w:r>
-        <w:t xml:space="preserve"> Wartość: 0.5      | TEST (Średnia/Max):  78.0% /  78.4% | TRENING (Średnia/Max):  81.7% /  82.2%</w:t>
-      </w:r>
-    </w:p>
-    <w:p>
-      <w:r>
-        <w:t xml:space="preserve"> Wartość: 0.9      | TEST (Średnia/Max):  85.8% /  87.7% | TRENING (Średnia/Max):  89.2% /  90.2%</w:t>
-      </w:r>
-    </w:p>
-    <w:p>
-      <w:r>
-        <w:t xml:space="preserve"> Wartość: 0.99     | TEST (Średnia/Max):  89.1% /  90.6% | TRENING (Średnia/Max):  95.1% /  96.0%</w:t>
-      </w:r>
-    </w:p>
-    <w:p>
-      <w:r>
-        <w:t>--- WYNIKI EKSPERYMENTÓW NA DANYCH (Liczba aut: 852) ---</w:t>
+        <w:t>1. Drzewa Decyzyjne (max_depth)</w:t>
+      </w:r>
+    </w:p>
+    <w:p>
+      <w:r>
+        <w:t>Drzewo       | max_depth: 3          | Uczący: 80.91% | Testowy: 74.27%</w:t>
+      </w:r>
+    </w:p>
+    <w:p>
+      <w:r>
+        <w:t>Drzewo       | max_depth: 5          | Uczący: 91.34% | Testowy: 83.04%</w:t>
+      </w:r>
+    </w:p>
+    <w:p>
+      <w:r>
+        <w:t>Drzewo       | max_depth: 10         | Uczący: 100.00% | Testowy: 81.29%</w:t>
+      </w:r>
+    </w:p>
+    <w:p>
+      <w:r>
+        <w:t>Drzewo       | max_depth: None       | Uczący: 100.00% | Testowy: 81.29%</w:t>
       </w:r>
     </w:p>
     <w:p/>
     <w:p>
       <w:r>
-        <w:t>1. Drzewa Decyzyjne (max_depth)</w:t>
-      </w:r>
-    </w:p>
-    <w:p>
-      <w:r>
-        <w:t>Drzewo       | max_depth: 3          | Uczący: 80.91% | Testowy: 74.27%</w:t>
-      </w:r>
-    </w:p>
-    <w:p>
-      <w:r>
-        <w:t>Drzewo       | max_depth: 5          | Uczący: 91.34% | Testowy: 83.04%</w:t>
-      </w:r>
-    </w:p>
-    <w:p>
-      <w:r>
-        <w:t>Drzewo       | max_depth: 10         | Uczący: 100.00% | Testowy: 81.29%</w:t>
-      </w:r>
-    </w:p>
-    <w:p>
-      <w:r>
-        <w:t>Drzewo       | max_depth: None       | Uczący: 100.00% | Testowy: 81.29%</w:t>
+        <w:t>2. k-Najbliższych Sąsiadów (n_neighbors)</w:t>
+      </w:r>
+    </w:p>
+    <w:p>
+      <w:pPr>
+        <w:rPr>
+          <w:lang w:val="en-US"/>
+        </w:rPr>
+      </w:pPr>
+      <w:r>
+        <w:rPr>
+          <w:lang w:val="en-US"/>
+        </w:rPr>
+        <w:t xml:space="preserve">k-NN         | </w:t>
+      </w:r>
+      <w:proofErr w:type="spellStart"/>
+      <w:r>
+        <w:rPr>
+          <w:lang w:val="en-US"/>
+        </w:rPr>
+        <w:t>n_neighbors</w:t>
+      </w:r>
+      <w:proofErr w:type="spellEnd"/>
+      <w:r>
+        <w:rPr>
+          <w:lang w:val="en-US"/>
+        </w:rPr>
+        <w:t xml:space="preserve">: 1          | </w:t>
+      </w:r>
+      <w:proofErr w:type="spellStart"/>
+      <w:r>
+        <w:rPr>
+          <w:lang w:val="en-US"/>
+        </w:rPr>
+        <w:t>Uczący</w:t>
+      </w:r>
+      <w:proofErr w:type="spellEnd"/>
+      <w:r>
+        <w:rPr>
+          <w:lang w:val="en-US"/>
+        </w:rPr>
+        <w:t xml:space="preserve">: 100.00% | </w:t>
+      </w:r>
+      <w:proofErr w:type="spellStart"/>
+      <w:r>
+        <w:rPr>
+          <w:lang w:val="en-US"/>
+        </w:rPr>
+        <w:t>Testowy</w:t>
+      </w:r>
+      <w:proofErr w:type="spellEnd"/>
+      <w:r>
+        <w:rPr>
+          <w:lang w:val="en-US"/>
+        </w:rPr>
+        <w:t>: 88.89%</w:t>
+      </w:r>
+    </w:p>
+    <w:p>
+      <w:pPr>
+        <w:rPr>
+          <w:lang w:val="en-US"/>
+        </w:rPr>
+      </w:pPr>
+      <w:r>
+        <w:rPr>
+          <w:lang w:val="en-US"/>
+        </w:rPr>
+        <w:t xml:space="preserve">k-NN         | </w:t>
+      </w:r>
+      <w:proofErr w:type="spellStart"/>
+      <w:r>
+        <w:rPr>
+          <w:lang w:val="en-US"/>
+        </w:rPr>
+        <w:t>n_neighbors</w:t>
+      </w:r>
+      <w:proofErr w:type="spellEnd"/>
+      <w:r>
+        <w:rPr>
+          <w:lang w:val="en-US"/>
+        </w:rPr>
+        <w:t xml:space="preserve">: 3          | </w:t>
+      </w:r>
+      <w:proofErr w:type="spellStart"/>
+      <w:r>
+        <w:rPr>
+          <w:lang w:val="en-US"/>
+        </w:rPr>
+        <w:t>Uczący</w:t>
+      </w:r>
+      <w:proofErr w:type="spellEnd"/>
+      <w:r>
+        <w:rPr>
+          <w:lang w:val="en-US"/>
+        </w:rPr>
+        <w:t xml:space="preserve">: 94.42% | </w:t>
+      </w:r>
+      <w:proofErr w:type="spellStart"/>
+      <w:r>
+        <w:rPr>
+          <w:lang w:val="en-US"/>
+        </w:rPr>
+        <w:t>Testowy</w:t>
+      </w:r>
+      <w:proofErr w:type="spellEnd"/>
+      <w:r>
+        <w:rPr>
+          <w:lang w:val="en-US"/>
+        </w:rPr>
+        <w:t>: 88.89%</w:t>
+      </w:r>
+    </w:p>
+    <w:p>
+      <w:pPr>
+        <w:rPr>
+          <w:lang w:val="en-US"/>
+        </w:rPr>
+      </w:pPr>
+      <w:r>
+        <w:rPr>
+          <w:lang w:val="en-US"/>
+        </w:rPr>
+        <w:t xml:space="preserve">k-NN         | </w:t>
+      </w:r>
+      <w:proofErr w:type="spellStart"/>
+      <w:r>
+        <w:rPr>
+          <w:lang w:val="en-US"/>
+        </w:rPr>
+        <w:t>n_neighbors</w:t>
+      </w:r>
+      <w:proofErr w:type="spellEnd"/>
+      <w:r>
+        <w:rPr>
+          <w:lang w:val="en-US"/>
+        </w:rPr>
+        <w:t xml:space="preserve">: 5          | </w:t>
+      </w:r>
+      <w:proofErr w:type="spellStart"/>
+      <w:r>
+        <w:rPr>
+          <w:lang w:val="en-US"/>
+        </w:rPr>
+        <w:t>Uczący</w:t>
+      </w:r>
+      <w:proofErr w:type="spellEnd"/>
+      <w:r>
+        <w:rPr>
+          <w:lang w:val="en-US"/>
+        </w:rPr>
+        <w:t xml:space="preserve">: 91.78% | </w:t>
+      </w:r>
+      <w:proofErr w:type="spellStart"/>
+      <w:r>
+        <w:rPr>
+          <w:lang w:val="en-US"/>
+        </w:rPr>
+        <w:t>Testowy</w:t>
+      </w:r>
+      <w:proofErr w:type="spellEnd"/>
+      <w:r>
+        <w:rPr>
+          <w:lang w:val="en-US"/>
+        </w:rPr>
+        <w:t>: 87.72%</w:t>
+      </w:r>
+    </w:p>
+    <w:p>
+      <w:pPr>
+        <w:rPr>
+          <w:lang w:val="en-US"/>
+        </w:rPr>
+      </w:pPr>
+      <w:r>
+        <w:rPr>
+          <w:lang w:val="en-US"/>
+        </w:rPr>
+        <w:t xml:space="preserve">k-NN         | </w:t>
+      </w:r>
+      <w:proofErr w:type="spellStart"/>
+      <w:r>
+        <w:rPr>
+          <w:lang w:val="en-US"/>
+        </w:rPr>
+        <w:t>n_neighbors</w:t>
+      </w:r>
+      <w:proofErr w:type="spellEnd"/>
+      <w:r>
+        <w:rPr>
+          <w:lang w:val="en-US"/>
+        </w:rPr>
+        <w:t xml:space="preserve">: 7          | </w:t>
+      </w:r>
+      <w:proofErr w:type="spellStart"/>
+      <w:r>
+        <w:rPr>
+          <w:lang w:val="en-US"/>
+        </w:rPr>
+        <w:t>Uczący</w:t>
+      </w:r>
+      <w:proofErr w:type="spellEnd"/>
+      <w:r>
+        <w:rPr>
+          <w:lang w:val="en-US"/>
+        </w:rPr>
+        <w:t xml:space="preserve">: 91.78% | </w:t>
+      </w:r>
+      <w:proofErr w:type="spellStart"/>
+      <w:r>
+        <w:rPr>
+          <w:lang w:val="en-US"/>
+        </w:rPr>
+        <w:t>Testowy</w:t>
+      </w:r>
+      <w:proofErr w:type="spellEnd"/>
+      <w:r>
+        <w:rPr>
+          <w:lang w:val="en-US"/>
+        </w:rPr>
+        <w:t>: 87.13%</w:t>
+      </w:r>
+    </w:p>
+    <w:p>
+      <w:pPr>
+        <w:rPr>
+          <w:lang w:val="en-US"/>
+        </w:rPr>
+      </w:pPr>
+    </w:p>
+    <w:p>
+      <w:r>
+        <w:t>3. Maszyny Wektorów Nośnych (kernel)</w:t>
+      </w:r>
+    </w:p>
+    <w:p>
+      <w:r>
+        <w:t>SVM          | kernel: linear     | Uczący: 89.13% | Testowy: 81.87%</w:t>
+      </w:r>
+    </w:p>
+    <w:p>
+      <w:r>
+        <w:t>SVM          | kernel: poly       | Uczący: 86.34% | Testowy: 78.95%</w:t>
+      </w:r>
+    </w:p>
+    <w:p>
+      <w:r>
+        <w:t>SVM          | kernel: rbf        | Uczący: 90.75% | Testowy: 88.89%</w:t>
+      </w:r>
+    </w:p>
+    <w:p>
+      <w:r>
+        <w:t>SVM          | kernel: sigmoid    | Uczący: 65.49% | Testowy: 59.06%</w:t>
       </w:r>
     </w:p>
     <w:p/>
     <w:p>
-      <w:r>
-        <w:t>2. k-Najbliższych Sąsiadów (n_neighbors)</w:t>
-      </w:r>
-    </w:p>
-    <w:p>
-      <w:r>
-        <w:t>k-NN         | n_neighbors: 1          | Uczący: 100.00% | Testowy: 88.89%</w:t>
-      </w:r>
-    </w:p>
-    <w:p>
-      <w:r>
-        <w:t>k-NN         | n_neighbors: 3          | Uczący: 94.42% | Testowy: 88.89%</w:t>
-      </w:r>
-    </w:p>
-    <w:p>
-      <w:r>
-        <w:t>k-NN         | n_neighbors: 5          | Uczący: 91.78% | Testowy: 87.72%</w:t>
-      </w:r>
-    </w:p>
-    <w:p>
-      <w:r>
-        <w:t>k-NN         | n_neighbors: 7          | Uczący: 91.78% | Testowy: 87.13%</w:t>
-      </w:r>
-    </w:p>
-    <w:p/>
-    <w:p>
-      <w:r>
-        <w:t>3. Maszyny Wektorów Nośnych (kernel)</w:t>
-      </w:r>
-    </w:p>
-    <w:p>
-      <w:r>
-        <w:t>SVM          | kernel: linear     | Uczący: 89.13% | Testowy: 81.87%</w:t>
-      </w:r>
-    </w:p>
-    <w:p>
-      <w:r>
-        <w:t>SVM          | kernel: poly       | Uczący: 86.34% | Testowy: 78.95%</w:t>
-      </w:r>
-    </w:p>
-    <w:p>
-      <w:r>
-        <w:t>SVM          | kernel: rbf        | Uczący: 90.75% | Testowy: 88.89%</w:t>
-      </w:r>
-    </w:p>
-    <w:p>
-      <w:r>
-        <w:t>SVM          | kernel: sigmoid    | Uczący: 65.49% | Testowy: 59.06%</w:t>
-      </w:r>
-    </w:p>
-    <w:p/>
-    <w:p>
-      <w:r>
-        <w:t>4. Las Losowy (n_estimators)</w:t>
-      </w:r>
-    </w:p>
-    <w:p>
-      <w:r>
-        <w:t>Las Losowy   | n_estimators: 10         | Uczący: 99.71% | Testowy: 84.80%</w:t>
-      </w:r>
-    </w:p>
-    <w:p>
-      <w:r>
-        <w:t>Las Losowy   | n_estimators: 50         | Uczący: 100.00% | Testowy: 89.47%</w:t>
-      </w:r>
-    </w:p>
-    <w:p>
-      <w:r>
-        <w:t>Las Losowy   | n_estimators: 100        | Uczący: 100.00% | Testowy: 87.72%</w:t>
+      <w:pPr>
+        <w:rPr>
+          <w:lang w:val="en-US"/>
+        </w:rPr>
+      </w:pPr>
+      <w:r>
+        <w:rPr>
+          <w:lang w:val="en-US"/>
+        </w:rPr>
+        <w:t xml:space="preserve">4. Las </w:t>
+      </w:r>
+      <w:proofErr w:type="spellStart"/>
+      <w:r>
+        <w:rPr>
+          <w:lang w:val="en-US"/>
+        </w:rPr>
+        <w:t>Losowy</w:t>
+      </w:r>
+      <w:proofErr w:type="spellEnd"/>
+      <w:r>
+        <w:rPr>
+          <w:lang w:val="en-US"/>
+        </w:rPr>
+        <w:t xml:space="preserve"> (</w:t>
+      </w:r>
+      <w:proofErr w:type="spellStart"/>
+      <w:r>
+        <w:rPr>
+          <w:lang w:val="en-US"/>
+        </w:rPr>
+        <w:t>n_estimators</w:t>
+      </w:r>
+      <w:proofErr w:type="spellEnd"/>
+      <w:r>
+        <w:rPr>
+          <w:lang w:val="en-US"/>
+        </w:rPr>
+        <w:t>)</w:t>
+      </w:r>
+    </w:p>
+    <w:p>
+      <w:pPr>
+        <w:rPr>
+          <w:lang w:val="en-US"/>
+        </w:rPr>
+      </w:pPr>
+      <w:r>
+        <w:rPr>
+          <w:lang w:val="en-US"/>
+        </w:rPr>
+        <w:t xml:space="preserve">Las </w:t>
+      </w:r>
+      <w:proofErr w:type="spellStart"/>
+      <w:r>
+        <w:rPr>
+          <w:lang w:val="en-US"/>
+        </w:rPr>
+        <w:t>Losowy</w:t>
+      </w:r>
+      <w:proofErr w:type="spellEnd"/>
+      <w:r>
+        <w:rPr>
+          <w:lang w:val="en-US"/>
+        </w:rPr>
+        <w:t xml:space="preserve">   | </w:t>
+      </w:r>
+      <w:proofErr w:type="spellStart"/>
+      <w:r>
+        <w:rPr>
+          <w:lang w:val="en-US"/>
+        </w:rPr>
+        <w:t>n_estimators</w:t>
+      </w:r>
+      <w:proofErr w:type="spellEnd"/>
+      <w:r>
+        <w:rPr>
+          <w:lang w:val="en-US"/>
+        </w:rPr>
+        <w:t xml:space="preserve">: 10         | </w:t>
+      </w:r>
+      <w:proofErr w:type="spellStart"/>
+      <w:r>
+        <w:rPr>
+          <w:lang w:val="en-US"/>
+        </w:rPr>
+        <w:t>Uczący</w:t>
+      </w:r>
+      <w:proofErr w:type="spellEnd"/>
+      <w:r>
+        <w:rPr>
+          <w:lang w:val="en-US"/>
+        </w:rPr>
+        <w:t xml:space="preserve">: 99.71% | </w:t>
+      </w:r>
+      <w:proofErr w:type="spellStart"/>
+      <w:r>
+        <w:rPr>
+          <w:lang w:val="en-US"/>
+        </w:rPr>
+        <w:t>Testowy</w:t>
+      </w:r>
+      <w:proofErr w:type="spellEnd"/>
+      <w:r>
+        <w:rPr>
+          <w:lang w:val="en-US"/>
+        </w:rPr>
+        <w:t>: 84.80%</w:t>
+      </w:r>
+    </w:p>
+    <w:p>
+      <w:pPr>
+        <w:rPr>
+          <w:lang w:val="en-US"/>
+        </w:rPr>
+      </w:pPr>
+      <w:r>
+        <w:rPr>
+          <w:lang w:val="en-US"/>
+        </w:rPr>
+        <w:t xml:space="preserve">Las </w:t>
+      </w:r>
+      <w:proofErr w:type="spellStart"/>
+      <w:r>
+        <w:rPr>
+          <w:lang w:val="en-US"/>
+        </w:rPr>
+        <w:t>Losowy</w:t>
+      </w:r>
+      <w:proofErr w:type="spellEnd"/>
+      <w:r>
+        <w:rPr>
+          <w:lang w:val="en-US"/>
+        </w:rPr>
+        <w:t xml:space="preserve">   | </w:t>
+      </w:r>
+      <w:proofErr w:type="spellStart"/>
+      <w:r>
+        <w:rPr>
+          <w:lang w:val="en-US"/>
+        </w:rPr>
+        <w:t>n_estimators</w:t>
+      </w:r>
+      <w:proofErr w:type="spellEnd"/>
+      <w:r>
+        <w:rPr>
+          <w:lang w:val="en-US"/>
+        </w:rPr>
+        <w:t xml:space="preserve">: 50         | </w:t>
+      </w:r>
+      <w:proofErr w:type="spellStart"/>
+      <w:r>
+        <w:rPr>
+          <w:lang w:val="en-US"/>
+        </w:rPr>
+        <w:t>Uczący</w:t>
+      </w:r>
+      <w:proofErr w:type="spellEnd"/>
+      <w:r>
+        <w:rPr>
+          <w:lang w:val="en-US"/>
+        </w:rPr>
+        <w:t xml:space="preserve">: 100.00% | </w:t>
+      </w:r>
+      <w:proofErr w:type="spellStart"/>
+      <w:r>
+        <w:rPr>
+          <w:lang w:val="en-US"/>
+        </w:rPr>
+        <w:t>Testowy</w:t>
+      </w:r>
+      <w:proofErr w:type="spellEnd"/>
+      <w:r>
+        <w:rPr>
+          <w:lang w:val="en-US"/>
+        </w:rPr>
+        <w:t>: 89.47%</w:t>
+      </w:r>
+    </w:p>
+    <w:p>
+      <w:pPr>
+        <w:rPr>
+          <w:lang w:val="en-US"/>
+        </w:rPr>
+      </w:pPr>
+      <w:r>
+        <w:rPr>
+          <w:lang w:val="en-US"/>
+        </w:rPr>
+        <w:t xml:space="preserve">Las </w:t>
+      </w:r>
+      <w:proofErr w:type="spellStart"/>
+      <w:r>
+        <w:rPr>
+          <w:lang w:val="en-US"/>
+        </w:rPr>
+        <w:t>Losowy</w:t>
+      </w:r>
+      <w:proofErr w:type="spellEnd"/>
+      <w:r>
+        <w:rPr>
+          <w:lang w:val="en-US"/>
+        </w:rPr>
+        <w:t xml:space="preserve">   | </w:t>
+      </w:r>
+      <w:proofErr w:type="spellStart"/>
+      <w:r>
+        <w:rPr>
+          <w:lang w:val="en-US"/>
+        </w:rPr>
+        <w:t>n_estimators</w:t>
+      </w:r>
+      <w:proofErr w:type="spellEnd"/>
+      <w:r>
+        <w:rPr>
+          <w:lang w:val="en-US"/>
+        </w:rPr>
+        <w:t xml:space="preserve">: 100        | </w:t>
+      </w:r>
+      <w:proofErr w:type="spellStart"/>
+      <w:r>
+        <w:rPr>
+          <w:lang w:val="en-US"/>
+        </w:rPr>
+        <w:t>Uczący</w:t>
+      </w:r>
+      <w:proofErr w:type="spellEnd"/>
+      <w:r>
+        <w:rPr>
+          <w:lang w:val="en-US"/>
+        </w:rPr>
+        <w:t xml:space="preserve">: 100.00% | </w:t>
+      </w:r>
+      <w:proofErr w:type="spellStart"/>
+      <w:r>
+        <w:rPr>
+          <w:lang w:val="en-US"/>
+        </w:rPr>
+        <w:t>Testowy</w:t>
+      </w:r>
+      <w:proofErr w:type="spellEnd"/>
+      <w:r>
+        <w:rPr>
+          <w:lang w:val="en-US"/>
+        </w:rPr>
+        <w:t>: 87.72%</w:t>
       </w:r>
     </w:p>
     <w:p>
@@ -1473,6 +2037,231 @@
 <file path=word/numbering.xml><?xml version="1.0" encoding="utf-8"?>
 <w:numbering xmlns:wpc="http://schemas.microsoft.com/office/word/2010/wordprocessingCanvas" xmlns:cx="http://schemas.microsoft.com/office/drawing/2014/chartex" xmlns:cx1="http://schemas.microsoft.com/office/drawing/2015/9/8/chartex" xmlns:cx2="http://schemas.microsoft.com/office/drawing/2015/10/21/chartex" xmlns:cx3="http://schemas.microsoft.com/office/drawing/2016/5/9/chartex" xmlns:cx4="http://schemas.microsoft.com/office/drawing/2016/5/10/chartex" xmlns:cx5="http://schemas.microsoft.com/office/drawing/2016/5/11/chartex" xmlns:cx6="http://schemas.microsoft.com/office/drawing/2016/5/12/chartex" xmlns:cx7="http://schemas.microsoft.com/office/drawing/2016/5/13/chartex" xmlns:cx8="http://schemas.microsoft.com/office/drawing/2016/5/14/chartex" xmlns:mc="http://schemas.openxmlformats.org/markup-compatibility/2006" xmlns:aink="http://schemas.microsoft.com/office/drawing/2016/ink" xmlns:am3d="http://schemas.microsoft.com/office/drawing/2017/model3d" xmlns:o="urn:schemas-microsoft-com:office:office" xmlns:oel="http://schemas.microsoft.com/office/2019/extlst" xmlns:r="http://schemas.openxmlformats.org/officeDocument/2006/relationships" xmlns:m="http://schemas.openxmlformats.org/officeDocument/2006/math" xmlns:v="urn:schemas-microsoft-com:vml" xmlns:wp14="http://schemas.microsoft.com/office/word/2010/wordprocessingDrawing" xmlns:wp="http://schemas.openxmlformats.org/drawingml/2006/wordprocessingDrawing" xmlns:w10="urn:schemas-microsoft-com:office:word" xmlns:w="http://schemas.openxmlformats.org/wordprocessingml/2006/main" xmlns:w14="http://schemas.microsoft.com/office/word/2010/wordml" xmlns:w15="http://schemas.microsoft.com/office/word/2012/wordml" xmlns:w16cex="http://schemas.microsoft.com/office/word/2018/wordml/cex" xmlns:w16cid="http://schemas.microsoft.com/office/word/2016/wordml/cid" xmlns:w16="http://schemas.microsoft.com/office/word/2018/wordml" xmlns:w16du="http://schemas.microsoft.com/office/word/2023/wordml/word16du" xmlns:w16sdtdh="http://schemas.microsoft.com/office/word/2020/wordml/sdtdatahash" xmlns:w16sdtfl="http://schemas.microsoft.com/office/word/2024/wordml/sdtformatlock" xmlns:w16se="http://schemas.microsoft.com/office/word/2015/wordml/symex" xmlns:wpg="http://schemas.microsoft.com/office/word/2010/wordprocessingGroup" xmlns:wpi="http://schemas.microsoft.com/office/word/2010/wordprocessingInk" xmlns:wne="http://schemas.microsoft.com/office/word/2006/wordml" xmlns:wps="http://schemas.microsoft.com/office/word/2010/wordprocessingShape" mc:Ignorable="w14 w15 w16se w16cid w16 w16cex w16sdtdh w16sdtfl w16du wp14">
   <w:abstractNum w:abstractNumId="0" w15:restartNumberingAfterBreak="0">
+    <w:nsid w:val="01A835F3"/>
+    <w:multiLevelType w:val="hybridMultilevel"/>
+    <w:tmpl w:val="B76AE466"/>
+    <w:lvl w:ilvl="0" w:tplc="04150001">
+      <w:start w:val="1"/>
+      <w:numFmt w:val="bullet"/>
+      <w:lvlText w:val=""/>
+      <w:lvlJc w:val="left"/>
+      <w:pPr>
+        <w:ind w:left="785" w:hanging="360"/>
+      </w:pPr>
+      <w:rPr>
+        <w:rFonts w:ascii="Symbol" w:hAnsi="Symbol" w:hint="default"/>
+      </w:rPr>
+    </w:lvl>
+    <w:lvl w:ilvl="1" w:tplc="04150003" w:tentative="1">
+      <w:start w:val="1"/>
+      <w:numFmt w:val="bullet"/>
+      <w:lvlText w:val="o"/>
+      <w:lvlJc w:val="left"/>
+      <w:pPr>
+        <w:ind w:left="1145" w:hanging="360"/>
+      </w:pPr>
+      <w:rPr>
+        <w:rFonts w:ascii="Courier New" w:hAnsi="Courier New" w:cs="Courier New" w:hint="default"/>
+      </w:rPr>
+    </w:lvl>
+    <w:lvl w:ilvl="2" w:tplc="04150005" w:tentative="1">
+      <w:start w:val="1"/>
+      <w:numFmt w:val="bullet"/>
+      <w:lvlText w:val=""/>
+      <w:lvlJc w:val="left"/>
+      <w:pPr>
+        <w:ind w:left="1865" w:hanging="360"/>
+      </w:pPr>
+      <w:rPr>
+        <w:rFonts w:ascii="Wingdings" w:hAnsi="Wingdings" w:hint="default"/>
+      </w:rPr>
+    </w:lvl>
+    <w:lvl w:ilvl="3" w:tplc="04150001" w:tentative="1">
+      <w:start w:val="1"/>
+      <w:numFmt w:val="bullet"/>
+      <w:lvlText w:val=""/>
+      <w:lvlJc w:val="left"/>
+      <w:pPr>
+        <w:ind w:left="2585" w:hanging="360"/>
+      </w:pPr>
+      <w:rPr>
+        <w:rFonts w:ascii="Symbol" w:hAnsi="Symbol" w:hint="default"/>
+      </w:rPr>
+    </w:lvl>
+    <w:lvl w:ilvl="4" w:tplc="04150003" w:tentative="1">
+      <w:start w:val="1"/>
+      <w:numFmt w:val="bullet"/>
+      <w:lvlText w:val="o"/>
+      <w:lvlJc w:val="left"/>
+      <w:pPr>
+        <w:ind w:left="3305" w:hanging="360"/>
+      </w:pPr>
+      <w:rPr>
+        <w:rFonts w:ascii="Courier New" w:hAnsi="Courier New" w:cs="Courier New" w:hint="default"/>
+      </w:rPr>
+    </w:lvl>
+    <w:lvl w:ilvl="5" w:tplc="04150005" w:tentative="1">
+      <w:start w:val="1"/>
+      <w:numFmt w:val="bullet"/>
+      <w:lvlText w:val=""/>
+      <w:lvlJc w:val="left"/>
+      <w:pPr>
+        <w:ind w:left="4025" w:hanging="360"/>
+      </w:pPr>
+      <w:rPr>
+        <w:rFonts w:ascii="Wingdings" w:hAnsi="Wingdings" w:hint="default"/>
+      </w:rPr>
+    </w:lvl>
+    <w:lvl w:ilvl="6" w:tplc="04150001" w:tentative="1">
+      <w:start w:val="1"/>
+      <w:numFmt w:val="bullet"/>
+      <w:lvlText w:val=""/>
+      <w:lvlJc w:val="left"/>
+      <w:pPr>
+        <w:ind w:left="4745" w:hanging="360"/>
+      </w:pPr>
+      <w:rPr>
+        <w:rFonts w:ascii="Symbol" w:hAnsi="Symbol" w:hint="default"/>
+      </w:rPr>
+    </w:lvl>
+    <w:lvl w:ilvl="7" w:tplc="04150003" w:tentative="1">
+      <w:start w:val="1"/>
+      <w:numFmt w:val="bullet"/>
+      <w:lvlText w:val="o"/>
+      <w:lvlJc w:val="left"/>
+      <w:pPr>
+        <w:ind w:left="5465" w:hanging="360"/>
+      </w:pPr>
+      <w:rPr>
+        <w:rFonts w:ascii="Courier New" w:hAnsi="Courier New" w:cs="Courier New" w:hint="default"/>
+      </w:rPr>
+    </w:lvl>
+    <w:lvl w:ilvl="8" w:tplc="04150005" w:tentative="1">
+      <w:start w:val="1"/>
+      <w:numFmt w:val="bullet"/>
+      <w:lvlText w:val=""/>
+      <w:lvlJc w:val="left"/>
+      <w:pPr>
+        <w:ind w:left="6185" w:hanging="360"/>
+      </w:pPr>
+      <w:rPr>
+        <w:rFonts w:ascii="Wingdings" w:hAnsi="Wingdings" w:hint="default"/>
+      </w:rPr>
+    </w:lvl>
+  </w:abstractNum>
+  <w:abstractNum w:abstractNumId="1" w15:restartNumberingAfterBreak="0">
+    <w:nsid w:val="021A4689"/>
+    <w:multiLevelType w:val="multilevel"/>
+    <w:tmpl w:val="939679F0"/>
+    <w:lvl w:ilvl="0">
+      <w:numFmt w:val="decimal"/>
+      <w:lvlText w:val="%1"/>
+      <w:lvlJc w:val="left"/>
+      <w:pPr>
+        <w:ind w:left="375" w:hanging="375"/>
+      </w:pPr>
+      <w:rPr>
+        <w:rFonts w:hint="default"/>
+      </w:rPr>
+    </w:lvl>
+    <w:lvl w:ilvl="1">
+      <w:start w:val="1"/>
+      <w:numFmt w:val="decimal"/>
+      <w:lvlText w:val="%1.%2"/>
+      <w:lvlJc w:val="left"/>
+      <w:pPr>
+        <w:ind w:left="735" w:hanging="375"/>
+      </w:pPr>
+      <w:rPr>
+        <w:rFonts w:hint="default"/>
+      </w:rPr>
+    </w:lvl>
+    <w:lvl w:ilvl="2">
+      <w:start w:val="1"/>
+      <w:numFmt w:val="decimal"/>
+      <w:lvlText w:val="%1.%2.%3"/>
+      <w:lvlJc w:val="left"/>
+      <w:pPr>
+        <w:ind w:left="1440" w:hanging="720"/>
+      </w:pPr>
+      <w:rPr>
+        <w:rFonts w:hint="default"/>
+      </w:rPr>
+    </w:lvl>
+    <w:lvl w:ilvl="3">
+      <w:start w:val="1"/>
+      <w:numFmt w:val="decimal"/>
+      <w:lvlText w:val="%1.%2.%3.%4"/>
+      <w:lvlJc w:val="left"/>
+      <w:pPr>
+        <w:ind w:left="2160" w:hanging="1080"/>
+      </w:pPr>
+      <w:rPr>
+        <w:rFonts w:hint="default"/>
+      </w:rPr>
+    </w:lvl>
+    <w:lvl w:ilvl="4">
+      <w:start w:val="1"/>
+      <w:numFmt w:val="decimal"/>
+      <w:lvlText w:val="%1.%2.%3.%4.%5"/>
+      <w:lvlJc w:val="left"/>
+      <w:pPr>
+        <w:ind w:left="2520" w:hanging="1080"/>
+      </w:pPr>
+      <w:rPr>
+        <w:rFonts w:hint="default"/>
+      </w:rPr>
+    </w:lvl>
+    <w:lvl w:ilvl="5">
+      <w:start w:val="1"/>
+      <w:numFmt w:val="decimal"/>
+      <w:lvlText w:val="%1.%2.%3.%4.%5.%6"/>
+      <w:lvlJc w:val="left"/>
+      <w:pPr>
+        <w:ind w:left="3240" w:hanging="1440"/>
+      </w:pPr>
+      <w:rPr>
+        <w:rFonts w:hint="default"/>
+      </w:rPr>
+    </w:lvl>
+    <w:lvl w:ilvl="6">
+      <w:start w:val="1"/>
+      <w:numFmt w:val="decimal"/>
+      <w:lvlText w:val="%1.%2.%3.%4.%5.%6.%7"/>
+      <w:lvlJc w:val="left"/>
+      <w:pPr>
+        <w:ind w:left="3600" w:hanging="1440"/>
+      </w:pPr>
+      <w:rPr>
+        <w:rFonts w:hint="default"/>
+      </w:rPr>
+    </w:lvl>
+    <w:lvl w:ilvl="7">
+      <w:start w:val="1"/>
+      <w:numFmt w:val="decimal"/>
+      <w:lvlText w:val="%1.%2.%3.%4.%5.%6.%7.%8"/>
+      <w:lvlJc w:val="left"/>
+      <w:pPr>
+        <w:ind w:left="4320" w:hanging="1800"/>
+      </w:pPr>
+      <w:rPr>
+        <w:rFonts w:hint="default"/>
+      </w:rPr>
+    </w:lvl>
+    <w:lvl w:ilvl="8">
+      <w:start w:val="1"/>
+      <w:numFmt w:val="decimal"/>
+      <w:lvlText w:val="%1.%2.%3.%4.%5.%6.%7.%8.%9"/>
+      <w:lvlJc w:val="left"/>
+      <w:pPr>
+        <w:ind w:left="4680" w:hanging="1800"/>
+      </w:pPr>
+      <w:rPr>
+        <w:rFonts w:hint="default"/>
+      </w:rPr>
+    </w:lvl>
+  </w:abstractNum>
+  <w:abstractNum w:abstractNumId="2" w15:restartNumberingAfterBreak="0">
     <w:nsid w:val="0457216C"/>
     <w:multiLevelType w:val="multilevel"/>
     <w:tmpl w:val="D7045BAE"/>
@@ -1621,7 +2410,7 @@
       </w:rPr>
     </w:lvl>
   </w:abstractNum>
-  <w:abstractNum w:abstractNumId="1" w15:restartNumberingAfterBreak="0">
+  <w:abstractNum w:abstractNumId="3" w15:restartNumberingAfterBreak="0">
     <w:nsid w:val="16BF44C5"/>
     <w:multiLevelType w:val="multilevel"/>
     <w:tmpl w:val="00609D9A"/>
@@ -1770,7 +2559,7 @@
       </w:rPr>
     </w:lvl>
   </w:abstractNum>
-  <w:abstractNum w:abstractNumId="2" w15:restartNumberingAfterBreak="0">
+  <w:abstractNum w:abstractNumId="4" w15:restartNumberingAfterBreak="0">
     <w:nsid w:val="1F357DB9"/>
     <w:multiLevelType w:val="multilevel"/>
     <w:tmpl w:val="0248E23E"/>
@@ -1883,7 +2672,7 @@
       </w:pPr>
     </w:lvl>
   </w:abstractNum>
-  <w:abstractNum w:abstractNumId="3" w15:restartNumberingAfterBreak="0">
+  <w:abstractNum w:abstractNumId="5" w15:restartNumberingAfterBreak="0">
     <w:nsid w:val="237E5A7B"/>
     <w:multiLevelType w:val="multilevel"/>
     <w:tmpl w:val="DCEA76B4"/>
@@ -2032,7 +2821,7 @@
       </w:rPr>
     </w:lvl>
   </w:abstractNum>
-  <w:abstractNum w:abstractNumId="4" w15:restartNumberingAfterBreak="0">
+  <w:abstractNum w:abstractNumId="6" w15:restartNumberingAfterBreak="0">
     <w:nsid w:val="2AB76997"/>
     <w:multiLevelType w:val="multilevel"/>
     <w:tmpl w:val="4360260A"/>
@@ -2181,7 +2970,7 @@
       </w:rPr>
     </w:lvl>
   </w:abstractNum>
-  <w:abstractNum w:abstractNumId="5" w15:restartNumberingAfterBreak="0">
+  <w:abstractNum w:abstractNumId="7" w15:restartNumberingAfterBreak="0">
     <w:nsid w:val="445B0A05"/>
     <w:multiLevelType w:val="multilevel"/>
     <w:tmpl w:val="0EFAC81C"/>
@@ -2330,7 +3119,7 @@
       </w:rPr>
     </w:lvl>
   </w:abstractNum>
-  <w:abstractNum w:abstractNumId="6" w15:restartNumberingAfterBreak="0">
+  <w:abstractNum w:abstractNumId="8" w15:restartNumberingAfterBreak="0">
     <w:nsid w:val="479C6908"/>
     <w:multiLevelType w:val="multilevel"/>
     <w:tmpl w:val="41920B24"/>
@@ -2479,7 +3268,7 @@
       </w:rPr>
     </w:lvl>
   </w:abstractNum>
-  <w:abstractNum w:abstractNumId="7" w15:restartNumberingAfterBreak="0">
+  <w:abstractNum w:abstractNumId="9" w15:restartNumberingAfterBreak="0">
     <w:nsid w:val="4C7455F1"/>
     <w:multiLevelType w:val="multilevel"/>
     <w:tmpl w:val="9F54D2D8"/>
@@ -2628,7 +3417,7 @@
       </w:rPr>
     </w:lvl>
   </w:abstractNum>
-  <w:abstractNum w:abstractNumId="8" w15:restartNumberingAfterBreak="0">
+  <w:abstractNum w:abstractNumId="10" w15:restartNumberingAfterBreak="0">
     <w:nsid w:val="4CE70A26"/>
     <w:multiLevelType w:val="multilevel"/>
     <w:tmpl w:val="0F4E79CE"/>
@@ -2777,7 +3566,156 @@
       </w:rPr>
     </w:lvl>
   </w:abstractNum>
-  <w:abstractNum w:abstractNumId="9" w15:restartNumberingAfterBreak="0">
+  <w:abstractNum w:abstractNumId="11" w15:restartNumberingAfterBreak="0">
+    <w:nsid w:val="52A54E53"/>
+    <w:multiLevelType w:val="multilevel"/>
+    <w:tmpl w:val="D7045BAE"/>
+    <w:lvl w:ilvl="0">
+      <w:start w:val="1"/>
+      <w:numFmt w:val="bullet"/>
+      <w:lvlText w:val=""/>
+      <w:lvlJc w:val="left"/>
+      <w:pPr>
+        <w:tabs>
+          <w:tab w:val="num" w:pos="720"/>
+        </w:tabs>
+        <w:ind w:left="720" w:hanging="360"/>
+      </w:pPr>
+      <w:rPr>
+        <w:rFonts w:ascii="Symbol" w:hAnsi="Symbol" w:hint="default"/>
+        <w:sz w:val="20"/>
+      </w:rPr>
+    </w:lvl>
+    <w:lvl w:ilvl="1" w:tentative="1">
+      <w:start w:val="1"/>
+      <w:numFmt w:val="bullet"/>
+      <w:lvlText w:val="o"/>
+      <w:lvlJc w:val="left"/>
+      <w:pPr>
+        <w:tabs>
+          <w:tab w:val="num" w:pos="1440"/>
+        </w:tabs>
+        <w:ind w:left="1440" w:hanging="360"/>
+      </w:pPr>
+      <w:rPr>
+        <w:rFonts w:ascii="Courier New" w:hAnsi="Courier New" w:hint="default"/>
+        <w:sz w:val="20"/>
+      </w:rPr>
+    </w:lvl>
+    <w:lvl w:ilvl="2" w:tentative="1">
+      <w:start w:val="1"/>
+      <w:numFmt w:val="bullet"/>
+      <w:lvlText w:val=""/>
+      <w:lvlJc w:val="left"/>
+      <w:pPr>
+        <w:tabs>
+          <w:tab w:val="num" w:pos="2160"/>
+        </w:tabs>
+        <w:ind w:left="2160" w:hanging="360"/>
+      </w:pPr>
+      <w:rPr>
+        <w:rFonts w:ascii="Wingdings" w:hAnsi="Wingdings" w:hint="default"/>
+        <w:sz w:val="20"/>
+      </w:rPr>
+    </w:lvl>
+    <w:lvl w:ilvl="3" w:tentative="1">
+      <w:start w:val="1"/>
+      <w:numFmt w:val="bullet"/>
+      <w:lvlText w:val=""/>
+      <w:lvlJc w:val="left"/>
+      <w:pPr>
+        <w:tabs>
+          <w:tab w:val="num" w:pos="2880"/>
+        </w:tabs>
+        <w:ind w:left="2880" w:hanging="360"/>
+      </w:pPr>
+      <w:rPr>
+        <w:rFonts w:ascii="Wingdings" w:hAnsi="Wingdings" w:hint="default"/>
+        <w:sz w:val="20"/>
+      </w:rPr>
+    </w:lvl>
+    <w:lvl w:ilvl="4" w:tentative="1">
+      <w:start w:val="1"/>
+      <w:numFmt w:val="bullet"/>
+      <w:lvlText w:val=""/>
+      <w:lvlJc w:val="left"/>
+      <w:pPr>
+        <w:tabs>
+          <w:tab w:val="num" w:pos="3600"/>
+        </w:tabs>
+        <w:ind w:left="3600" w:hanging="360"/>
+      </w:pPr>
+      <w:rPr>
+        <w:rFonts w:ascii="Wingdings" w:hAnsi="Wingdings" w:hint="default"/>
+        <w:sz w:val="20"/>
+      </w:rPr>
+    </w:lvl>
+    <w:lvl w:ilvl="5" w:tentative="1">
+      <w:start w:val="1"/>
+      <w:numFmt w:val="bullet"/>
+      <w:lvlText w:val=""/>
+      <w:lvlJc w:val="left"/>
+      <w:pPr>
+        <w:tabs>
+          <w:tab w:val="num" w:pos="4320"/>
+        </w:tabs>
+        <w:ind w:left="4320" w:hanging="360"/>
+      </w:pPr>
+      <w:rPr>
+        <w:rFonts w:ascii="Wingdings" w:hAnsi="Wingdings" w:hint="default"/>
+        <w:sz w:val="20"/>
+      </w:rPr>
+    </w:lvl>
+    <w:lvl w:ilvl="6" w:tentative="1">
+      <w:start w:val="1"/>
+      <w:numFmt w:val="bullet"/>
+      <w:lvlText w:val=""/>
+      <w:lvlJc w:val="left"/>
+      <w:pPr>
+        <w:tabs>
+          <w:tab w:val="num" w:pos="5040"/>
+        </w:tabs>
+        <w:ind w:left="5040" w:hanging="360"/>
+      </w:pPr>
+      <w:rPr>
+        <w:rFonts w:ascii="Wingdings" w:hAnsi="Wingdings" w:hint="default"/>
+        <w:sz w:val="20"/>
+      </w:rPr>
+    </w:lvl>
+    <w:lvl w:ilvl="7" w:tentative="1">
+      <w:start w:val="1"/>
+      <w:numFmt w:val="bullet"/>
+      <w:lvlText w:val=""/>
+      <w:lvlJc w:val="left"/>
+      <w:pPr>
+        <w:tabs>
+          <w:tab w:val="num" w:pos="5760"/>
+        </w:tabs>
+        <w:ind w:left="5760" w:hanging="360"/>
+      </w:pPr>
+      <w:rPr>
+        <w:rFonts w:ascii="Wingdings" w:hAnsi="Wingdings" w:hint="default"/>
+        <w:sz w:val="20"/>
+      </w:rPr>
+    </w:lvl>
+    <w:lvl w:ilvl="8" w:tentative="1">
+      <w:start w:val="1"/>
+      <w:numFmt w:val="bullet"/>
+      <w:lvlText w:val=""/>
+      <w:lvlJc w:val="left"/>
+      <w:pPr>
+        <w:tabs>
+          <w:tab w:val="num" w:pos="6480"/>
+        </w:tabs>
+        <w:ind w:left="6480" w:hanging="360"/>
+      </w:pPr>
+      <w:rPr>
+        <w:rFonts w:ascii="Wingdings" w:hAnsi="Wingdings" w:hint="default"/>
+        <w:sz w:val="20"/>
+      </w:rPr>
+    </w:lvl>
+  </w:abstractNum>
+  <w:abstractNum w:abstractNumId="12" w15:restartNumberingAfterBreak="0">
     <w:nsid w:val="536E7A3F"/>
     <w:multiLevelType w:val="multilevel"/>
     <w:tmpl w:val="3F064760"/>
@@ -2926,7 +3864,7 @@
       </w:rPr>
     </w:lvl>
   </w:abstractNum>
-  <w:abstractNum w:abstractNumId="10" w15:restartNumberingAfterBreak="0">
+  <w:abstractNum w:abstractNumId="13" w15:restartNumberingAfterBreak="0">
     <w:nsid w:val="54DD5D6C"/>
     <w:multiLevelType w:val="multilevel"/>
     <w:tmpl w:val="815E6262"/>
@@ -3075,7 +4013,120 @@
       </w:rPr>
     </w:lvl>
   </w:abstractNum>
-  <w:abstractNum w:abstractNumId="11" w15:restartNumberingAfterBreak="0">
+  <w:abstractNum w:abstractNumId="14" w15:restartNumberingAfterBreak="0">
+    <w:nsid w:val="5AD86346"/>
+    <w:multiLevelType w:val="hybridMultilevel"/>
+    <w:tmpl w:val="E78A3676"/>
+    <w:lvl w:ilvl="0" w:tplc="04150001">
+      <w:start w:val="1"/>
+      <w:numFmt w:val="bullet"/>
+      <w:lvlText w:val=""/>
+      <w:lvlJc w:val="left"/>
+      <w:pPr>
+        <w:ind w:left="1080" w:hanging="360"/>
+      </w:pPr>
+      <w:rPr>
+        <w:rFonts w:ascii="Symbol" w:hAnsi="Symbol" w:hint="default"/>
+      </w:rPr>
+    </w:lvl>
+    <w:lvl w:ilvl="1" w:tplc="04150003" w:tentative="1">
+      <w:start w:val="1"/>
+      <w:numFmt w:val="bullet"/>
+      <w:lvlText w:val="o"/>
+      <w:lvlJc w:val="left"/>
+      <w:pPr>
+        <w:ind w:left="1800" w:hanging="360"/>
+      </w:pPr>
+      <w:rPr>
+        <w:rFonts w:ascii="Courier New" w:hAnsi="Courier New" w:cs="Courier New" w:hint="default"/>
+      </w:rPr>
+    </w:lvl>
+    <w:lvl w:ilvl="2" w:tplc="04150005" w:tentative="1">
+      <w:start w:val="1"/>
+      <w:numFmt w:val="bullet"/>
+      <w:lvlText w:val=""/>
+      <w:lvlJc w:val="left"/>
+      <w:pPr>
+        <w:ind w:left="2520" w:hanging="360"/>
+      </w:pPr>
+      <w:rPr>
+        <w:rFonts w:ascii="Wingdings" w:hAnsi="Wingdings" w:hint="default"/>
+      </w:rPr>
+    </w:lvl>
+    <w:lvl w:ilvl="3" w:tplc="04150001" w:tentative="1">
+      <w:start w:val="1"/>
+      <w:numFmt w:val="bullet"/>
+      <w:lvlText w:val=""/>
+      <w:lvlJc w:val="left"/>
+      <w:pPr>
+        <w:ind w:left="3240" w:hanging="360"/>
+      </w:pPr>
+      <w:rPr>
+        <w:rFonts w:ascii="Symbol" w:hAnsi="Symbol" w:hint="default"/>
+      </w:rPr>
+    </w:lvl>
+    <w:lvl w:ilvl="4" w:tplc="04150003" w:tentative="1">
+      <w:start w:val="1"/>
+      <w:numFmt w:val="bullet"/>
+      <w:lvlText w:val="o"/>
+      <w:lvlJc w:val="left"/>
+      <w:pPr>
+        <w:ind w:left="3960" w:hanging="360"/>
+      </w:pPr>
+      <w:rPr>
+        <w:rFonts w:ascii="Courier New" w:hAnsi="Courier New" w:cs="Courier New" w:hint="default"/>
+      </w:rPr>
+    </w:lvl>
+    <w:lvl w:ilvl="5" w:tplc="04150005" w:tentative="1">
+      <w:start w:val="1"/>
+      <w:numFmt w:val="bullet"/>
+      <w:lvlText w:val=""/>
+      <w:lvlJc w:val="left"/>
+      <w:pPr>
+        <w:ind w:left="4680" w:hanging="360"/>
+      </w:pPr>
+      <w:rPr>
+        <w:rFonts w:ascii="Wingdings" w:hAnsi="Wingdings" w:hint="default"/>
+      </w:rPr>
+    </w:lvl>
+    <w:lvl w:ilvl="6" w:tplc="04150001" w:tentative="1">
+      <w:start w:val="1"/>
+      <w:numFmt w:val="bullet"/>
+      <w:lvlText w:val=""/>
+      <w:lvlJc w:val="left"/>
+      <w:pPr>
+        <w:ind w:left="5400" w:hanging="360"/>
+      </w:pPr>
+      <w:rPr>
+        <w:rFonts w:ascii="Symbol" w:hAnsi="Symbol" w:hint="default"/>
+      </w:rPr>
+    </w:lvl>
+    <w:lvl w:ilvl="7" w:tplc="04150003" w:tentative="1">
+      <w:start w:val="1"/>
+      <w:numFmt w:val="bullet"/>
+      <w:lvlText w:val="o"/>
+      <w:lvlJc w:val="left"/>
+      <w:pPr>
+        <w:ind w:left="6120" w:hanging="360"/>
+      </w:pPr>
+      <w:rPr>
+        <w:rFonts w:ascii="Courier New" w:hAnsi="Courier New" w:cs="Courier New" w:hint="default"/>
+      </w:rPr>
+    </w:lvl>
+    <w:lvl w:ilvl="8" w:tplc="04150005" w:tentative="1">
+      <w:start w:val="1"/>
+      <w:numFmt w:val="bullet"/>
+      <w:lvlText w:val=""/>
+      <w:lvlJc w:val="left"/>
+      <w:pPr>
+        <w:ind w:left="6840" w:hanging="360"/>
+      </w:pPr>
+      <w:rPr>
+        <w:rFonts w:ascii="Wingdings" w:hAnsi="Wingdings" w:hint="default"/>
+      </w:rPr>
+    </w:lvl>
+  </w:abstractNum>
+  <w:abstractNum w:abstractNumId="15" w15:restartNumberingAfterBreak="0">
     <w:nsid w:val="628E2D32"/>
     <w:multiLevelType w:val="multilevel"/>
     <w:tmpl w:val="36A8342C"/>
@@ -3224,7 +4275,7 @@
       </w:rPr>
     </w:lvl>
   </w:abstractNum>
-  <w:abstractNum w:abstractNumId="12" w15:restartNumberingAfterBreak="0">
+  <w:abstractNum w:abstractNumId="16" w15:restartNumberingAfterBreak="0">
     <w:nsid w:val="67B43D5F"/>
     <w:multiLevelType w:val="multilevel"/>
     <w:tmpl w:val="4118A4E6"/>
@@ -3337,7 +4388,7 @@
       </w:pPr>
     </w:lvl>
   </w:abstractNum>
-  <w:abstractNum w:abstractNumId="13" w15:restartNumberingAfterBreak="0">
+  <w:abstractNum w:abstractNumId="17" w15:restartNumberingAfterBreak="0">
     <w:nsid w:val="6BEA3194"/>
     <w:multiLevelType w:val="multilevel"/>
     <w:tmpl w:val="711A5954"/>
@@ -3486,7 +4537,7 @@
       </w:rPr>
     </w:lvl>
   </w:abstractNum>
-  <w:abstractNum w:abstractNumId="14" w15:restartNumberingAfterBreak="0">
+  <w:abstractNum w:abstractNumId="18" w15:restartNumberingAfterBreak="0">
     <w:nsid w:val="72D23A74"/>
     <w:multiLevelType w:val="multilevel"/>
     <w:tmpl w:val="5FDE32F0"/>
@@ -3635,7 +4686,156 @@
       </w:rPr>
     </w:lvl>
   </w:abstractNum>
-  <w:abstractNum w:abstractNumId="15" w15:restartNumberingAfterBreak="0">
+  <w:abstractNum w:abstractNumId="19" w15:restartNumberingAfterBreak="0">
+    <w:nsid w:val="7B2C2727"/>
+    <w:multiLevelType w:val="multilevel"/>
+    <w:tmpl w:val="D7045BAE"/>
+    <w:lvl w:ilvl="0">
+      <w:start w:val="1"/>
+      <w:numFmt w:val="bullet"/>
+      <w:lvlText w:val=""/>
+      <w:lvlJc w:val="left"/>
+      <w:pPr>
+        <w:tabs>
+          <w:tab w:val="num" w:pos="720"/>
+        </w:tabs>
+        <w:ind w:left="720" w:hanging="360"/>
+      </w:pPr>
+      <w:rPr>
+        <w:rFonts w:ascii="Symbol" w:hAnsi="Symbol" w:hint="default"/>
+        <w:sz w:val="20"/>
+      </w:rPr>
+    </w:lvl>
+    <w:lvl w:ilvl="1" w:tentative="1">
+      <w:start w:val="1"/>
+      <w:numFmt w:val="bullet"/>
+      <w:lvlText w:val="o"/>
+      <w:lvlJc w:val="left"/>
+      <w:pPr>
+        <w:tabs>
+          <w:tab w:val="num" w:pos="1440"/>
+        </w:tabs>
+        <w:ind w:left="1440" w:hanging="360"/>
+      </w:pPr>
+      <w:rPr>
+        <w:rFonts w:ascii="Courier New" w:hAnsi="Courier New" w:hint="default"/>
+        <w:sz w:val="20"/>
+      </w:rPr>
+    </w:lvl>
+    <w:lvl w:ilvl="2" w:tentative="1">
+      <w:start w:val="1"/>
+      <w:numFmt w:val="bullet"/>
+      <w:lvlText w:val=""/>
+      <w:lvlJc w:val="left"/>
+      <w:pPr>
+        <w:tabs>
+          <w:tab w:val="num" w:pos="2160"/>
+        </w:tabs>
+        <w:ind w:left="2160" w:hanging="360"/>
+      </w:pPr>
+      <w:rPr>
+        <w:rFonts w:ascii="Wingdings" w:hAnsi="Wingdings" w:hint="default"/>
+        <w:sz w:val="20"/>
+      </w:rPr>
+    </w:lvl>
+    <w:lvl w:ilvl="3" w:tentative="1">
+      <w:start w:val="1"/>
+      <w:numFmt w:val="bullet"/>
+      <w:lvlText w:val=""/>
+      <w:lvlJc w:val="left"/>
+      <w:pPr>
+        <w:tabs>
+          <w:tab w:val="num" w:pos="2880"/>
+        </w:tabs>
+        <w:ind w:left="2880" w:hanging="360"/>
+      </w:pPr>
+      <w:rPr>
+        <w:rFonts w:ascii="Wingdings" w:hAnsi="Wingdings" w:hint="default"/>
+        <w:sz w:val="20"/>
+      </w:rPr>
+    </w:lvl>
+    <w:lvl w:ilvl="4" w:tentative="1">
+      <w:start w:val="1"/>
+      <w:numFmt w:val="bullet"/>
+      <w:lvlText w:val=""/>
+      <w:lvlJc w:val="left"/>
+      <w:pPr>
+        <w:tabs>
+          <w:tab w:val="num" w:pos="3600"/>
+        </w:tabs>
+        <w:ind w:left="3600" w:hanging="360"/>
+      </w:pPr>
+      <w:rPr>
+        <w:rFonts w:ascii="Wingdings" w:hAnsi="Wingdings" w:hint="default"/>
+        <w:sz w:val="20"/>
+      </w:rPr>
+    </w:lvl>
+    <w:lvl w:ilvl="5" w:tentative="1">
+      <w:start w:val="1"/>
+      <w:numFmt w:val="bullet"/>
+      <w:lvlText w:val=""/>
+      <w:lvlJc w:val="left"/>
+      <w:pPr>
+        <w:tabs>
+          <w:tab w:val="num" w:pos="4320"/>
+        </w:tabs>
+        <w:ind w:left="4320" w:hanging="360"/>
+      </w:pPr>
+      <w:rPr>
+        <w:rFonts w:ascii="Wingdings" w:hAnsi="Wingdings" w:hint="default"/>
+        <w:sz w:val="20"/>
+      </w:rPr>
+    </w:lvl>
+    <w:lvl w:ilvl="6" w:tentative="1">
+      <w:start w:val="1"/>
+      <w:numFmt w:val="bullet"/>
+      <w:lvlText w:val=""/>
+      <w:lvlJc w:val="left"/>
+      <w:pPr>
+        <w:tabs>
+          <w:tab w:val="num" w:pos="5040"/>
+        </w:tabs>
+        <w:ind w:left="5040" w:hanging="360"/>
+      </w:pPr>
+      <w:rPr>
+        <w:rFonts w:ascii="Wingdings" w:hAnsi="Wingdings" w:hint="default"/>
+        <w:sz w:val="20"/>
+      </w:rPr>
+    </w:lvl>
+    <w:lvl w:ilvl="7" w:tentative="1">
+      <w:start w:val="1"/>
+      <w:numFmt w:val="bullet"/>
+      <w:lvlText w:val=""/>
+      <w:lvlJc w:val="left"/>
+      <w:pPr>
+        <w:tabs>
+          <w:tab w:val="num" w:pos="5760"/>
+        </w:tabs>
+        <w:ind w:left="5760" w:hanging="360"/>
+      </w:pPr>
+      <w:rPr>
+        <w:rFonts w:ascii="Wingdings" w:hAnsi="Wingdings" w:hint="default"/>
+        <w:sz w:val="20"/>
+      </w:rPr>
+    </w:lvl>
+    <w:lvl w:ilvl="8" w:tentative="1">
+      <w:start w:val="1"/>
+      <w:numFmt w:val="bullet"/>
+      <w:lvlText w:val=""/>
+      <w:lvlJc w:val="left"/>
+      <w:pPr>
+        <w:tabs>
+          <w:tab w:val="num" w:pos="6480"/>
+        </w:tabs>
+        <w:ind w:left="6480" w:hanging="360"/>
+      </w:pPr>
+      <w:rPr>
+        <w:rFonts w:ascii="Wingdings" w:hAnsi="Wingdings" w:hint="default"/>
+        <w:sz w:val="20"/>
+      </w:rPr>
+    </w:lvl>
+  </w:abstractNum>
+  <w:abstractNum w:abstractNumId="20" w15:restartNumberingAfterBreak="0">
     <w:nsid w:val="7D66047A"/>
     <w:multiLevelType w:val="multilevel"/>
     <w:tmpl w:val="CD1C503A"/>
@@ -3785,52 +4985,67 @@
     </w:lvl>
   </w:abstractNum>
   <w:num w:numId="1" w16cid:durableId="1167750880">
+    <w:abstractNumId w:val="2"/>
+  </w:num>
+  <w:num w:numId="2" w16cid:durableId="1196965040">
+    <w:abstractNumId w:val="16"/>
+  </w:num>
+  <w:num w:numId="3" w16cid:durableId="1340157896">
+    <w:abstractNumId w:val="6"/>
+  </w:num>
+  <w:num w:numId="4" w16cid:durableId="1455099385">
+    <w:abstractNumId w:val="12"/>
+  </w:num>
+  <w:num w:numId="5" w16cid:durableId="1505583258">
+    <w:abstractNumId w:val="3"/>
+  </w:num>
+  <w:num w:numId="6" w16cid:durableId="1672947363">
+    <w:abstractNumId w:val="13"/>
+  </w:num>
+  <w:num w:numId="7" w16cid:durableId="1874878142">
+    <w:abstractNumId w:val="8"/>
+  </w:num>
+  <w:num w:numId="8" w16cid:durableId="1935630831">
+    <w:abstractNumId w:val="4"/>
+  </w:num>
+  <w:num w:numId="9" w16cid:durableId="1969362158">
+    <w:abstractNumId w:val="15"/>
+  </w:num>
+  <w:num w:numId="10" w16cid:durableId="250771893">
+    <w:abstractNumId w:val="9"/>
+  </w:num>
+  <w:num w:numId="11" w16cid:durableId="543103497">
+    <w:abstractNumId w:val="5"/>
+  </w:num>
+  <w:num w:numId="12" w16cid:durableId="581334226">
+    <w:abstractNumId w:val="17"/>
+  </w:num>
+  <w:num w:numId="13" w16cid:durableId="680857412">
+    <w:abstractNumId w:val="20"/>
+  </w:num>
+  <w:num w:numId="14" w16cid:durableId="709183467">
+    <w:abstractNumId w:val="7"/>
+  </w:num>
+  <w:num w:numId="15" w16cid:durableId="737477055">
+    <w:abstractNumId w:val="10"/>
+  </w:num>
+  <w:num w:numId="16" w16cid:durableId="972640539">
+    <w:abstractNumId w:val="18"/>
+  </w:num>
+  <w:num w:numId="17" w16cid:durableId="858204391">
+    <w:abstractNumId w:val="14"/>
+  </w:num>
+  <w:num w:numId="18" w16cid:durableId="1075126080">
+    <w:abstractNumId w:val="1"/>
+  </w:num>
+  <w:num w:numId="19" w16cid:durableId="1498038412">
     <w:abstractNumId w:val="0"/>
   </w:num>
-  <w:num w:numId="2" w16cid:durableId="1196965040">
-    <w:abstractNumId w:val="12"/>
-  </w:num>
-  <w:num w:numId="3" w16cid:durableId="1340157896">
-    <w:abstractNumId w:val="4"/>
-  </w:num>
-  <w:num w:numId="4" w16cid:durableId="1455099385">
-    <w:abstractNumId w:val="9"/>
-  </w:num>
-  <w:num w:numId="5" w16cid:durableId="1505583258">
-    <w:abstractNumId w:val="1"/>
-  </w:num>
-  <w:num w:numId="6" w16cid:durableId="1672947363">
-    <w:abstractNumId w:val="10"/>
-  </w:num>
-  <w:num w:numId="7" w16cid:durableId="1874878142">
-    <w:abstractNumId w:val="6"/>
-  </w:num>
-  <w:num w:numId="8" w16cid:durableId="1935630831">
-    <w:abstractNumId w:val="2"/>
-  </w:num>
-  <w:num w:numId="9" w16cid:durableId="1969362158">
+  <w:num w:numId="20" w16cid:durableId="1808236427">
     <w:abstractNumId w:val="11"/>
   </w:num>
-  <w:num w:numId="10" w16cid:durableId="250771893">
-    <w:abstractNumId w:val="7"/>
-  </w:num>
-  <w:num w:numId="11" w16cid:durableId="543103497">
-    <w:abstractNumId w:val="3"/>
-  </w:num>
-  <w:num w:numId="12" w16cid:durableId="581334226">
-    <w:abstractNumId w:val="13"/>
-  </w:num>
-  <w:num w:numId="13" w16cid:durableId="680857412">
-    <w:abstractNumId w:val="15"/>
-  </w:num>
-  <w:num w:numId="14" w16cid:durableId="709183467">
-    <w:abstractNumId w:val="5"/>
-  </w:num>
-  <w:num w:numId="15" w16cid:durableId="737477055">
-    <w:abstractNumId w:val="8"/>
-  </w:num>
-  <w:num w:numId="16" w16cid:durableId="972640539">
-    <w:abstractNumId w:val="14"/>
+  <w:num w:numId="21" w16cid:durableId="1219439121">
+    <w:abstractNumId w:val="19"/>
   </w:num>
 </w:numbering>
 </file>
@@ -4232,16 +5447,16 @@
     <w:lsdException w:name="Unresolved Mention" w:semiHidden="1" w:unhideWhenUsed="1"/>
     <w:lsdException w:name="Smart Link" w:semiHidden="1" w:unhideWhenUsed="1"/>
   </w:latentStyles>
-  <w:style w:type="paragraph" w:default="1" w:styleId="Normalny">
+  <w:style w:type="paragraph" w:default="1" w:styleId="Normal">
     <w:name w:val="Normal"/>
     <w:qFormat/>
     <w:rsid w:val="00034CA6"/>
   </w:style>
-  <w:style w:type="paragraph" w:styleId="Nagwek1">
+  <w:style w:type="paragraph" w:styleId="Heading1">
     <w:name w:val="heading 1"/>
-    <w:basedOn w:val="Normalny"/>
-    <w:next w:val="Normalny"/>
-    <w:link w:val="Nagwek1Znak"/>
+    <w:basedOn w:val="Normal"/>
+    <w:next w:val="Normal"/>
+    <w:link w:val="Heading1Char"/>
     <w:uiPriority w:val="9"/>
     <w:qFormat/>
     <w:rsid w:val="009401CB"/>
@@ -4258,11 +5473,11 @@
       <w:szCs w:val="40"/>
     </w:rPr>
   </w:style>
-  <w:style w:type="paragraph" w:styleId="Nagwek2">
+  <w:style w:type="paragraph" w:styleId="Heading2">
     <w:name w:val="heading 2"/>
-    <w:basedOn w:val="Normalny"/>
-    <w:next w:val="Normalny"/>
-    <w:link w:val="Nagwek2Znak"/>
+    <w:basedOn w:val="Normal"/>
+    <w:next w:val="Normal"/>
+    <w:link w:val="Heading2Char"/>
     <w:uiPriority w:val="9"/>
     <w:semiHidden/>
     <w:unhideWhenUsed/>
@@ -4281,11 +5496,11 @@
       <w:szCs w:val="32"/>
     </w:rPr>
   </w:style>
-  <w:style w:type="paragraph" w:styleId="Nagwek3">
+  <w:style w:type="paragraph" w:styleId="Heading3">
     <w:name w:val="heading 3"/>
-    <w:basedOn w:val="Normalny"/>
-    <w:next w:val="Normalny"/>
-    <w:link w:val="Nagwek3Znak"/>
+    <w:basedOn w:val="Normal"/>
+    <w:next w:val="Normal"/>
+    <w:link w:val="Heading3Char"/>
     <w:uiPriority w:val="9"/>
     <w:semiHidden/>
     <w:unhideWhenUsed/>
@@ -4304,11 +5519,11 @@
       <w:szCs w:val="28"/>
     </w:rPr>
   </w:style>
-  <w:style w:type="paragraph" w:styleId="Nagwek4">
+  <w:style w:type="paragraph" w:styleId="Heading4">
     <w:name w:val="heading 4"/>
-    <w:basedOn w:val="Normalny"/>
-    <w:next w:val="Normalny"/>
-    <w:link w:val="Nagwek4Znak"/>
+    <w:basedOn w:val="Normal"/>
+    <w:next w:val="Normal"/>
+    <w:link w:val="Heading4Char"/>
     <w:uiPriority w:val="9"/>
     <w:semiHidden/>
     <w:unhideWhenUsed/>
@@ -4327,11 +5542,11 @@
       <w:color w:val="0F4761" w:themeColor="accent1" w:themeShade="BF"/>
     </w:rPr>
   </w:style>
-  <w:style w:type="paragraph" w:styleId="Nagwek5">
+  <w:style w:type="paragraph" w:styleId="Heading5">
     <w:name w:val="heading 5"/>
-    <w:basedOn w:val="Normalny"/>
-    <w:next w:val="Normalny"/>
-    <w:link w:val="Nagwek5Znak"/>
+    <w:basedOn w:val="Normal"/>
+    <w:next w:val="Normal"/>
+    <w:link w:val="Heading5Char"/>
     <w:uiPriority w:val="9"/>
     <w:semiHidden/>
     <w:unhideWhenUsed/>
@@ -4348,11 +5563,11 @@
       <w:color w:val="0F4761" w:themeColor="accent1" w:themeShade="BF"/>
     </w:rPr>
   </w:style>
-  <w:style w:type="paragraph" w:styleId="Nagwek6">
+  <w:style w:type="paragraph" w:styleId="Heading6">
     <w:name w:val="heading 6"/>
-    <w:basedOn w:val="Normalny"/>
-    <w:next w:val="Normalny"/>
-    <w:link w:val="Nagwek6Znak"/>
+    <w:basedOn w:val="Normal"/>
+    <w:next w:val="Normal"/>
+    <w:link w:val="Heading6Char"/>
     <w:uiPriority w:val="9"/>
     <w:semiHidden/>
     <w:unhideWhenUsed/>
@@ -4371,11 +5586,11 @@
       <w:color w:val="595959" w:themeColor="text1" w:themeTint="A6"/>
     </w:rPr>
   </w:style>
-  <w:style w:type="paragraph" w:styleId="Nagwek7">
+  <w:style w:type="paragraph" w:styleId="Heading7">
     <w:name w:val="heading 7"/>
-    <w:basedOn w:val="Normalny"/>
-    <w:next w:val="Normalny"/>
-    <w:link w:val="Nagwek7Znak"/>
+    <w:basedOn w:val="Normal"/>
+    <w:next w:val="Normal"/>
+    <w:link w:val="Heading7Char"/>
     <w:uiPriority w:val="9"/>
     <w:semiHidden/>
     <w:unhideWhenUsed/>
@@ -4392,11 +5607,11 @@
       <w:color w:val="595959" w:themeColor="text1" w:themeTint="A6"/>
     </w:rPr>
   </w:style>
-  <w:style w:type="paragraph" w:styleId="Nagwek8">
+  <w:style w:type="paragraph" w:styleId="Heading8">
     <w:name w:val="heading 8"/>
-    <w:basedOn w:val="Normalny"/>
-    <w:next w:val="Normalny"/>
-    <w:link w:val="Nagwek8Znak"/>
+    <w:basedOn w:val="Normal"/>
+    <w:next w:val="Normal"/>
+    <w:link w:val="Heading8Char"/>
     <w:uiPriority w:val="9"/>
     <w:semiHidden/>
     <w:unhideWhenUsed/>
@@ -4415,11 +5630,11 @@
       <w:color w:val="272727" w:themeColor="text1" w:themeTint="D8"/>
     </w:rPr>
   </w:style>
-  <w:style w:type="paragraph" w:styleId="Nagwek9">
+  <w:style w:type="paragraph" w:styleId="Heading9">
     <w:name w:val="heading 9"/>
-    <w:basedOn w:val="Normalny"/>
-    <w:next w:val="Normalny"/>
-    <w:link w:val="Nagwek9Znak"/>
+    <w:basedOn w:val="Normal"/>
+    <w:next w:val="Normal"/>
+    <w:link w:val="Heading9Char"/>
     <w:uiPriority w:val="9"/>
     <w:semiHidden/>
     <w:unhideWhenUsed/>
@@ -4436,13 +5651,12 @@
       <w:color w:val="272727" w:themeColor="text1" w:themeTint="D8"/>
     </w:rPr>
   </w:style>
-  <w:style w:type="character" w:default="1" w:styleId="Domylnaczcionkaakapitu">
+  <w:style w:type="character" w:default="1" w:styleId="DefaultParagraphFont">
     <w:name w:val="Default Paragraph Font"/>
     <w:uiPriority w:val="1"/>
-    <w:semiHidden/>
     <w:unhideWhenUsed/>
   </w:style>
-  <w:style w:type="table" w:default="1" w:styleId="Standardowy">
+  <w:style w:type="table" w:default="1" w:styleId="TableNormal">
     <w:name w:val="Normal Table"/>
     <w:uiPriority w:val="99"/>
     <w:semiHidden/>
@@ -4457,16 +5671,16 @@
       </w:tblCellMar>
     </w:tblPr>
   </w:style>
-  <w:style w:type="numbering" w:default="1" w:styleId="Bezlisty">
+  <w:style w:type="numbering" w:default="1" w:styleId="NoList">
     <w:name w:val="No List"/>
     <w:uiPriority w:val="99"/>
     <w:semiHidden/>
     <w:unhideWhenUsed/>
   </w:style>
-  <w:style w:type="character" w:customStyle="1" w:styleId="Nagwek1Znak">
-    <w:name w:val="Nagłówek 1 Znak"/>
-    <w:basedOn w:val="Domylnaczcionkaakapitu"/>
-    <w:link w:val="Nagwek1"/>
+  <w:style w:type="character" w:customStyle="1" w:styleId="Heading1Char">
+    <w:name w:val="Heading 1 Char"/>
+    <w:basedOn w:val="DefaultParagraphFont"/>
+    <w:link w:val="Heading1"/>
     <w:uiPriority w:val="9"/>
     <w:rsid w:val="009401CB"/>
     <w:rPr>
@@ -4476,10 +5690,10 @@
       <w:szCs w:val="40"/>
     </w:rPr>
   </w:style>
-  <w:style w:type="character" w:customStyle="1" w:styleId="Nagwek2Znak">
-    <w:name w:val="Nagłówek 2 Znak"/>
-    <w:basedOn w:val="Domylnaczcionkaakapitu"/>
-    <w:link w:val="Nagwek2"/>
+  <w:style w:type="character" w:customStyle="1" w:styleId="Heading2Char">
+    <w:name w:val="Heading 2 Char"/>
+    <w:basedOn w:val="DefaultParagraphFont"/>
+    <w:link w:val="Heading2"/>
     <w:uiPriority w:val="9"/>
     <w:semiHidden/>
     <w:rsid w:val="009401CB"/>
@@ -4490,10 +5704,10 @@
       <w:szCs w:val="32"/>
     </w:rPr>
   </w:style>
-  <w:style w:type="character" w:customStyle="1" w:styleId="Nagwek3Znak">
-    <w:name w:val="Nagłówek 3 Znak"/>
-    <w:basedOn w:val="Domylnaczcionkaakapitu"/>
-    <w:link w:val="Nagwek3"/>
+  <w:style w:type="character" w:customStyle="1" w:styleId="Heading3Char">
+    <w:name w:val="Heading 3 Char"/>
+    <w:basedOn w:val="DefaultParagraphFont"/>
+    <w:link w:val="Heading3"/>
     <w:uiPriority w:val="9"/>
     <w:semiHidden/>
     <w:rsid w:val="009401CB"/>
@@ -4504,10 +5718,10 @@
       <w:szCs w:val="28"/>
     </w:rPr>
   </w:style>
-  <w:style w:type="character" w:customStyle="1" w:styleId="Nagwek4Znak">
-    <w:name w:val="Nagłówek 4 Znak"/>
-    <w:basedOn w:val="Domylnaczcionkaakapitu"/>
-    <w:link w:val="Nagwek4"/>
+  <w:style w:type="character" w:customStyle="1" w:styleId="Heading4Char">
+    <w:name w:val="Heading 4 Char"/>
+    <w:basedOn w:val="DefaultParagraphFont"/>
+    <w:link w:val="Heading4"/>
     <w:uiPriority w:val="9"/>
     <w:semiHidden/>
     <w:rsid w:val="009401CB"/>
@@ -4518,10 +5732,10 @@
       <w:color w:val="0F4761" w:themeColor="accent1" w:themeShade="BF"/>
     </w:rPr>
   </w:style>
-  <w:style w:type="character" w:customStyle="1" w:styleId="Nagwek5Znak">
-    <w:name w:val="Nagłówek 5 Znak"/>
-    <w:basedOn w:val="Domylnaczcionkaakapitu"/>
-    <w:link w:val="Nagwek5"/>
+  <w:style w:type="character" w:customStyle="1" w:styleId="Heading5Char">
+    <w:name w:val="Heading 5 Char"/>
+    <w:basedOn w:val="DefaultParagraphFont"/>
+    <w:link w:val="Heading5"/>
     <w:uiPriority w:val="9"/>
     <w:semiHidden/>
     <w:rsid w:val="009401CB"/>
@@ -4530,10 +5744,10 @@
       <w:color w:val="0F4761" w:themeColor="accent1" w:themeShade="BF"/>
     </w:rPr>
   </w:style>
-  <w:style w:type="character" w:customStyle="1" w:styleId="Nagwek6Znak">
-    <w:name w:val="Nagłówek 6 Znak"/>
-    <w:basedOn w:val="Domylnaczcionkaakapitu"/>
-    <w:link w:val="Nagwek6"/>
+  <w:style w:type="character" w:customStyle="1" w:styleId="Heading6Char">
+    <w:name w:val="Heading 6 Char"/>
+    <w:basedOn w:val="DefaultParagraphFont"/>
+    <w:link w:val="Heading6"/>
     <w:uiPriority w:val="9"/>
     <w:semiHidden/>
     <w:rsid w:val="009401CB"/>
@@ -4544,10 +5758,10 @@
       <w:color w:val="595959" w:themeColor="text1" w:themeTint="A6"/>
     </w:rPr>
   </w:style>
-  <w:style w:type="character" w:customStyle="1" w:styleId="Nagwek7Znak">
-    <w:name w:val="Nagłówek 7 Znak"/>
-    <w:basedOn w:val="Domylnaczcionkaakapitu"/>
-    <w:link w:val="Nagwek7"/>
+  <w:style w:type="character" w:customStyle="1" w:styleId="Heading7Char">
+    <w:name w:val="Heading 7 Char"/>
+    <w:basedOn w:val="DefaultParagraphFont"/>
+    <w:link w:val="Heading7"/>
     <w:uiPriority w:val="9"/>
     <w:semiHidden/>
     <w:rsid w:val="009401CB"/>
@@ -4556,10 +5770,10 @@
       <w:color w:val="595959" w:themeColor="text1" w:themeTint="A6"/>
     </w:rPr>
   </w:style>
-  <w:style w:type="character" w:customStyle="1" w:styleId="Nagwek8Znak">
-    <w:name w:val="Nagłówek 8 Znak"/>
-    <w:basedOn w:val="Domylnaczcionkaakapitu"/>
-    <w:link w:val="Nagwek8"/>
+  <w:style w:type="character" w:customStyle="1" w:styleId="Heading8Char">
+    <w:name w:val="Heading 8 Char"/>
+    <w:basedOn w:val="DefaultParagraphFont"/>
+    <w:link w:val="Heading8"/>
     <w:uiPriority w:val="9"/>
     <w:semiHidden/>
     <w:rsid w:val="009401CB"/>
@@ -4570,10 +5784,10 @@
       <w:color w:val="272727" w:themeColor="text1" w:themeTint="D8"/>
     </w:rPr>
   </w:style>
-  <w:style w:type="character" w:customStyle="1" w:styleId="Nagwek9Znak">
-    <w:name w:val="Nagłówek 9 Znak"/>
-    <w:basedOn w:val="Domylnaczcionkaakapitu"/>
-    <w:link w:val="Nagwek9"/>
+  <w:style w:type="character" w:customStyle="1" w:styleId="Heading9Char">
+    <w:name w:val="Heading 9 Char"/>
+    <w:basedOn w:val="DefaultParagraphFont"/>
+    <w:link w:val="Heading9"/>
     <w:uiPriority w:val="9"/>
     <w:semiHidden/>
     <w:rsid w:val="009401CB"/>
@@ -4582,9 +5796,9 @@
       <w:color w:val="272727" w:themeColor="text1" w:themeTint="D8"/>
     </w:rPr>
   </w:style>
-  <w:style w:type="paragraph" w:styleId="Akapitzlist">
+  <w:style w:type="paragraph" w:styleId="ListParagraph">
     <w:name w:val="List Paragraph"/>
-    <w:basedOn w:val="Normalny"/>
+    <w:basedOn w:val="Normal"/>
     <w:uiPriority w:val="34"/>
     <w:qFormat/>
     <w:rsid w:val="009401CB"/>
@@ -4593,9 +5807,9 @@
       <w:contextualSpacing/>
     </w:pPr>
   </w:style>
-  <w:style w:type="character" w:styleId="Wyrnienieintensywne">
+  <w:style w:type="character" w:styleId="IntenseEmphasis">
     <w:name w:val="Intense Emphasis"/>
-    <w:basedOn w:val="Domylnaczcionkaakapitu"/>
+    <w:basedOn w:val="DefaultParagraphFont"/>
     <w:uiPriority w:val="21"/>
     <w:qFormat/>
     <w:rsid w:val="009401CB"/>
@@ -4605,9 +5819,9 @@
       <w:color w:val="0F4761" w:themeColor="accent1" w:themeShade="BF"/>
     </w:rPr>
   </w:style>
-  <w:style w:type="character" w:styleId="Odwoanieintensywne">
+  <w:style w:type="character" w:styleId="IntenseReference">
     <w:name w:val="Intense Reference"/>
-    <w:basedOn w:val="Domylnaczcionkaakapitu"/>
+    <w:basedOn w:val="DefaultParagraphFont"/>
     <w:uiPriority w:val="32"/>
     <w:qFormat/>
     <w:rsid w:val="009401CB"/>

</xml_diff>